<commit_message>
Add the twenty group members to the proposal title page
Fills the previously blank member table with the names, reference numbers and
index numbers supplied. The column header is corrected from 'Student ID' to
'Ref Number' to match the source list.

Transcribed from a supplied image, so the numbers should be checked against
the original before submission.
</commit_message>
<xml_diff>
--- a/Tameion_Systems_Proposal.docx
+++ b/Tameion_Systems_Proposal.docx
@@ -183,10 +183,10 @@
         </w:tblBorders>
       </w:tblPr>
       <w:tblGrid>
-        <w:gridCol w:w="700"/>
-        <w:gridCol w:w="4520"/>
-        <w:gridCol w:w="1900"/>
-        <w:gridCol w:w="1900"/>
+        <w:gridCol w:w="640"/>
+        <w:gridCol w:w="4700"/>
+        <w:gridCol w:w="1840"/>
+        <w:gridCol w:w="1840"/>
       </w:tblGrid>
       <w:tr>
         <w:trPr>
@@ -194,7 +194,7 @@
         </w:trPr>
         <w:tc>
           <w:tcPr>
-            <w:tcW w:type="dxa" w:w="700"/>
+            <w:tcW w:type="dxa" w:w="640"/>
             <w:shd w:fill="EDEDED" w:color="auto" w:val="clear"/>
             <w:tcMar>
               <w:top w:type="dxa" w:w="55"/>
@@ -217,13 +217,13 @@
                 <w:sz w:val="18"/>
                 <w:szCs w:val="18"/>
               </w:rPr>
-              <w:t xml:space="preserve">#</w:t>
-            </w:r>
-          </w:p>
-        </w:tc>
-        <w:tc>
-          <w:tcPr>
-            <w:tcW w:type="dxa" w:w="4520"/>
+              <w:t xml:space="preserve">No.</w:t>
+            </w:r>
+          </w:p>
+        </w:tc>
+        <w:tc>
+          <w:tcPr>
+            <w:tcW w:type="dxa" w:w="4700"/>
             <w:shd w:fill="EDEDED" w:color="auto" w:val="clear"/>
             <w:tcMar>
               <w:top w:type="dxa" w:w="55"/>
@@ -252,7 +252,7 @@
         </w:tc>
         <w:tc>
           <w:tcPr>
-            <w:tcW w:type="dxa" w:w="1900"/>
+            <w:tcW w:type="dxa" w:w="1840"/>
             <w:shd w:fill="EDEDED" w:color="auto" w:val="clear"/>
             <w:tcMar>
               <w:top w:type="dxa" w:w="55"/>
@@ -275,13 +275,13 @@
                 <w:sz w:val="18"/>
                 <w:szCs w:val="18"/>
               </w:rPr>
-              <w:t xml:space="preserve">Student ID</w:t>
-            </w:r>
-          </w:p>
-        </w:tc>
-        <w:tc>
-          <w:tcPr>
-            <w:tcW w:type="dxa" w:w="1900"/>
+              <w:t xml:space="preserve">Ref Number</w:t>
+            </w:r>
+          </w:p>
+        </w:tc>
+        <w:tc>
+          <w:tcPr>
+            <w:tcW w:type="dxa" w:w="1840"/>
             <w:shd w:fill="EDEDED" w:color="auto" w:val="clear"/>
             <w:tcMar>
               <w:top w:type="dxa" w:w="55"/>
@@ -312,18 +312,19 @@
       <w:tr>
         <w:tc>
           <w:tcPr>
-            <w:tcW w:type="dxa" w:w="700"/>
-            <w:tcMar>
-              <w:top w:type="dxa" w:w="55"/>
-              <w:left w:type="dxa" w:w="100"/>
-              <w:bottom w:type="dxa" w:w="55"/>
-              <w:right w:type="dxa" w:w="100"/>
-            </w:tcMar>
-            <w:vAlign w:val="center"/>
-          </w:tcPr>
-          <w:p>
-            <w:pPr>
-              <w:spacing w:after="0" w:line="240"/>
+            <w:tcW w:type="dxa" w:w="640"/>
+            <w:tcMar>
+              <w:top w:type="dxa" w:w="55"/>
+              <w:left w:type="dxa" w:w="100"/>
+              <w:bottom w:type="dxa" w:w="55"/>
+              <w:right w:type="dxa" w:w="100"/>
+            </w:tcMar>
+            <w:vAlign w:val="center"/>
+          </w:tcPr>
+          <w:p>
+            <w:pPr>
+              <w:spacing w:after="0" w:line="240"/>
+              <w:jc w:val="center"/>
             </w:pPr>
             <w:r>
               <w:rPr>
@@ -340,85 +341,87 @@
         </w:tc>
         <w:tc>
           <w:tcPr>
-            <w:tcW w:type="dxa" w:w="4520"/>
-            <w:tcMar>
-              <w:top w:type="dxa" w:w="55"/>
-              <w:left w:type="dxa" w:w="100"/>
-              <w:bottom w:type="dxa" w:w="55"/>
-              <w:right w:type="dxa" w:w="100"/>
-            </w:tcMar>
-            <w:vAlign w:val="center"/>
-          </w:tcPr>
-          <w:p>
-            <w:pPr>
-              <w:spacing w:after="0" w:line="240"/>
-            </w:pPr>
-            <w:r>
-              <w:rPr>
-                <w:rFonts w:ascii="Times New Roman" w:cs="Times New Roman" w:eastAsia="Times New Roman" w:hAnsi="Times New Roman"/>
-                <w:b w:val="false"/>
-                <w:bCs w:val="false"/>
-                <w:color w:val="000000"/>
-                <w:sz w:val="18"/>
-                <w:szCs w:val="18"/>
-              </w:rPr>
-              <w:t xml:space="preserve"/>
-            </w:r>
-          </w:p>
-        </w:tc>
-        <w:tc>
-          <w:tcPr>
-            <w:tcW w:type="dxa" w:w="1900"/>
-            <w:tcMar>
-              <w:top w:type="dxa" w:w="55"/>
-              <w:left w:type="dxa" w:w="100"/>
-              <w:bottom w:type="dxa" w:w="55"/>
-              <w:right w:type="dxa" w:w="100"/>
-            </w:tcMar>
-            <w:vAlign w:val="center"/>
-          </w:tcPr>
-          <w:p>
-            <w:pPr>
-              <w:spacing w:after="0" w:line="240"/>
-            </w:pPr>
-            <w:r>
-              <w:rPr>
-                <w:rFonts w:ascii="Times New Roman" w:cs="Times New Roman" w:eastAsia="Times New Roman" w:hAnsi="Times New Roman"/>
-                <w:b w:val="false"/>
-                <w:bCs w:val="false"/>
-                <w:color w:val="000000"/>
-                <w:sz w:val="18"/>
-                <w:szCs w:val="18"/>
-              </w:rPr>
-              <w:t xml:space="preserve"/>
-            </w:r>
-          </w:p>
-        </w:tc>
-        <w:tc>
-          <w:tcPr>
-            <w:tcW w:type="dxa" w:w="1900"/>
-            <w:tcMar>
-              <w:top w:type="dxa" w:w="55"/>
-              <w:left w:type="dxa" w:w="100"/>
-              <w:bottom w:type="dxa" w:w="55"/>
-              <w:right w:type="dxa" w:w="100"/>
-            </w:tcMar>
-            <w:vAlign w:val="center"/>
-          </w:tcPr>
-          <w:p>
-            <w:pPr>
-              <w:spacing w:after="0" w:line="240"/>
-            </w:pPr>
-            <w:r>
-              <w:rPr>
-                <w:rFonts w:ascii="Times New Roman" w:cs="Times New Roman" w:eastAsia="Times New Roman" w:hAnsi="Times New Roman"/>
-                <w:b w:val="false"/>
-                <w:bCs w:val="false"/>
-                <w:color w:val="000000"/>
-                <w:sz w:val="18"/>
-                <w:szCs w:val="18"/>
-              </w:rPr>
-              <w:t xml:space="preserve"/>
+            <w:tcW w:type="dxa" w:w="4700"/>
+            <w:tcMar>
+              <w:top w:type="dxa" w:w="55"/>
+              <w:left w:type="dxa" w:w="100"/>
+              <w:bottom w:type="dxa" w:w="55"/>
+              <w:right w:type="dxa" w:w="100"/>
+            </w:tcMar>
+            <w:vAlign w:val="center"/>
+          </w:tcPr>
+          <w:p>
+            <w:pPr>
+              <w:spacing w:after="0" w:line="240"/>
+            </w:pPr>
+            <w:r>
+              <w:rPr>
+                <w:rFonts w:ascii="Times New Roman" w:cs="Times New Roman" w:eastAsia="Times New Roman" w:hAnsi="Times New Roman"/>
+                <w:b w:val="false"/>
+                <w:bCs w:val="false"/>
+                <w:color w:val="000000"/>
+                <w:sz w:val="18"/>
+                <w:szCs w:val="18"/>
+              </w:rPr>
+              <w:t xml:space="preserve">Akologo Apoasan</w:t>
+            </w:r>
+          </w:p>
+        </w:tc>
+        <w:tc>
+          <w:tcPr>
+            <w:tcW w:type="dxa" w:w="1840"/>
+            <w:tcMar>
+              <w:top w:type="dxa" w:w="55"/>
+              <w:left w:type="dxa" w:w="100"/>
+              <w:bottom w:type="dxa" w:w="55"/>
+              <w:right w:type="dxa" w:w="100"/>
+            </w:tcMar>
+            <w:vAlign w:val="center"/>
+          </w:tcPr>
+          <w:p>
+            <w:pPr>
+              <w:spacing w:after="0" w:line="240"/>
+              <w:jc w:val="center"/>
+            </w:pPr>
+            <w:r>
+              <w:rPr>
+                <w:rFonts w:ascii="Times New Roman" w:cs="Times New Roman" w:eastAsia="Times New Roman" w:hAnsi="Times New Roman"/>
+                <w:b w:val="false"/>
+                <w:bCs w:val="false"/>
+                <w:color w:val="000000"/>
+                <w:sz w:val="18"/>
+                <w:szCs w:val="18"/>
+              </w:rPr>
+              <w:t xml:space="preserve">21183639</w:t>
+            </w:r>
+          </w:p>
+        </w:tc>
+        <w:tc>
+          <w:tcPr>
+            <w:tcW w:type="dxa" w:w="1840"/>
+            <w:tcMar>
+              <w:top w:type="dxa" w:w="55"/>
+              <w:left w:type="dxa" w:w="100"/>
+              <w:bottom w:type="dxa" w:w="55"/>
+              <w:right w:type="dxa" w:w="100"/>
+            </w:tcMar>
+            <w:vAlign w:val="center"/>
+          </w:tcPr>
+          <w:p>
+            <w:pPr>
+              <w:spacing w:after="0" w:line="240"/>
+              <w:jc w:val="center"/>
+            </w:pPr>
+            <w:r>
+              <w:rPr>
+                <w:rFonts w:ascii="Times New Roman" w:cs="Times New Roman" w:eastAsia="Times New Roman" w:hAnsi="Times New Roman"/>
+                <w:b w:val="false"/>
+                <w:bCs w:val="false"/>
+                <w:color w:val="000000"/>
+                <w:sz w:val="18"/>
+                <w:szCs w:val="18"/>
+              </w:rPr>
+              <w:t xml:space="preserve">6133424</w:t>
             </w:r>
           </w:p>
         </w:tc>
@@ -426,18 +429,19 @@
       <w:tr>
         <w:tc>
           <w:tcPr>
-            <w:tcW w:type="dxa" w:w="700"/>
-            <w:tcMar>
-              <w:top w:type="dxa" w:w="55"/>
-              <w:left w:type="dxa" w:w="100"/>
-              <w:bottom w:type="dxa" w:w="55"/>
-              <w:right w:type="dxa" w:w="100"/>
-            </w:tcMar>
-            <w:vAlign w:val="center"/>
-          </w:tcPr>
-          <w:p>
-            <w:pPr>
-              <w:spacing w:after="0" w:line="240"/>
+            <w:tcW w:type="dxa" w:w="640"/>
+            <w:tcMar>
+              <w:top w:type="dxa" w:w="55"/>
+              <w:left w:type="dxa" w:w="100"/>
+              <w:bottom w:type="dxa" w:w="55"/>
+              <w:right w:type="dxa" w:w="100"/>
+            </w:tcMar>
+            <w:vAlign w:val="center"/>
+          </w:tcPr>
+          <w:p>
+            <w:pPr>
+              <w:spacing w:after="0" w:line="240"/>
+              <w:jc w:val="center"/>
             </w:pPr>
             <w:r>
               <w:rPr>
@@ -454,85 +458,87 @@
         </w:tc>
         <w:tc>
           <w:tcPr>
-            <w:tcW w:type="dxa" w:w="4520"/>
-            <w:tcMar>
-              <w:top w:type="dxa" w:w="55"/>
-              <w:left w:type="dxa" w:w="100"/>
-              <w:bottom w:type="dxa" w:w="55"/>
-              <w:right w:type="dxa" w:w="100"/>
-            </w:tcMar>
-            <w:vAlign w:val="center"/>
-          </w:tcPr>
-          <w:p>
-            <w:pPr>
-              <w:spacing w:after="0" w:line="240"/>
-            </w:pPr>
-            <w:r>
-              <w:rPr>
-                <w:rFonts w:ascii="Times New Roman" w:cs="Times New Roman" w:eastAsia="Times New Roman" w:hAnsi="Times New Roman"/>
-                <w:b w:val="false"/>
-                <w:bCs w:val="false"/>
-                <w:color w:val="000000"/>
-                <w:sz w:val="18"/>
-                <w:szCs w:val="18"/>
-              </w:rPr>
-              <w:t xml:space="preserve"/>
-            </w:r>
-          </w:p>
-        </w:tc>
-        <w:tc>
-          <w:tcPr>
-            <w:tcW w:type="dxa" w:w="1900"/>
-            <w:tcMar>
-              <w:top w:type="dxa" w:w="55"/>
-              <w:left w:type="dxa" w:w="100"/>
-              <w:bottom w:type="dxa" w:w="55"/>
-              <w:right w:type="dxa" w:w="100"/>
-            </w:tcMar>
-            <w:vAlign w:val="center"/>
-          </w:tcPr>
-          <w:p>
-            <w:pPr>
-              <w:spacing w:after="0" w:line="240"/>
-            </w:pPr>
-            <w:r>
-              <w:rPr>
-                <w:rFonts w:ascii="Times New Roman" w:cs="Times New Roman" w:eastAsia="Times New Roman" w:hAnsi="Times New Roman"/>
-                <w:b w:val="false"/>
-                <w:bCs w:val="false"/>
-                <w:color w:val="000000"/>
-                <w:sz w:val="18"/>
-                <w:szCs w:val="18"/>
-              </w:rPr>
-              <w:t xml:space="preserve"/>
-            </w:r>
-          </w:p>
-        </w:tc>
-        <w:tc>
-          <w:tcPr>
-            <w:tcW w:type="dxa" w:w="1900"/>
-            <w:tcMar>
-              <w:top w:type="dxa" w:w="55"/>
-              <w:left w:type="dxa" w:w="100"/>
-              <w:bottom w:type="dxa" w:w="55"/>
-              <w:right w:type="dxa" w:w="100"/>
-            </w:tcMar>
-            <w:vAlign w:val="center"/>
-          </w:tcPr>
-          <w:p>
-            <w:pPr>
-              <w:spacing w:after="0" w:line="240"/>
-            </w:pPr>
-            <w:r>
-              <w:rPr>
-                <w:rFonts w:ascii="Times New Roman" w:cs="Times New Roman" w:eastAsia="Times New Roman" w:hAnsi="Times New Roman"/>
-                <w:b w:val="false"/>
-                <w:bCs w:val="false"/>
-                <w:color w:val="000000"/>
-                <w:sz w:val="18"/>
-                <w:szCs w:val="18"/>
-              </w:rPr>
-              <w:t xml:space="preserve"/>
+            <w:tcW w:type="dxa" w:w="4700"/>
+            <w:tcMar>
+              <w:top w:type="dxa" w:w="55"/>
+              <w:left w:type="dxa" w:w="100"/>
+              <w:bottom w:type="dxa" w:w="55"/>
+              <w:right w:type="dxa" w:w="100"/>
+            </w:tcMar>
+            <w:vAlign w:val="center"/>
+          </w:tcPr>
+          <w:p>
+            <w:pPr>
+              <w:spacing w:after="0" w:line="240"/>
+            </w:pPr>
+            <w:r>
+              <w:rPr>
+                <w:rFonts w:ascii="Times New Roman" w:cs="Times New Roman" w:eastAsia="Times New Roman" w:hAnsi="Times New Roman"/>
+                <w:b w:val="false"/>
+                <w:bCs w:val="false"/>
+                <w:color w:val="000000"/>
+                <w:sz w:val="18"/>
+                <w:szCs w:val="18"/>
+              </w:rPr>
+              <w:t xml:space="preserve">Osei Ellina Tabua</w:t>
+            </w:r>
+          </w:p>
+        </w:tc>
+        <w:tc>
+          <w:tcPr>
+            <w:tcW w:type="dxa" w:w="1840"/>
+            <w:tcMar>
+              <w:top w:type="dxa" w:w="55"/>
+              <w:left w:type="dxa" w:w="100"/>
+              <w:bottom w:type="dxa" w:w="55"/>
+              <w:right w:type="dxa" w:w="100"/>
+            </w:tcMar>
+            <w:vAlign w:val="center"/>
+          </w:tcPr>
+          <w:p>
+            <w:pPr>
+              <w:spacing w:after="0" w:line="240"/>
+              <w:jc w:val="center"/>
+            </w:pPr>
+            <w:r>
+              <w:rPr>
+                <w:rFonts w:ascii="Times New Roman" w:cs="Times New Roman" w:eastAsia="Times New Roman" w:hAnsi="Times New Roman"/>
+                <w:b w:val="false"/>
+                <w:bCs w:val="false"/>
+                <w:color w:val="000000"/>
+                <w:sz w:val="18"/>
+                <w:szCs w:val="18"/>
+              </w:rPr>
+              <w:t xml:space="preserve">21074687</w:t>
+            </w:r>
+          </w:p>
+        </w:tc>
+        <w:tc>
+          <w:tcPr>
+            <w:tcW w:type="dxa" w:w="1840"/>
+            <w:tcMar>
+              <w:top w:type="dxa" w:w="55"/>
+              <w:left w:type="dxa" w:w="100"/>
+              <w:bottom w:type="dxa" w:w="55"/>
+              <w:right w:type="dxa" w:w="100"/>
+            </w:tcMar>
+            <w:vAlign w:val="center"/>
+          </w:tcPr>
+          <w:p>
+            <w:pPr>
+              <w:spacing w:after="0" w:line="240"/>
+              <w:jc w:val="center"/>
+            </w:pPr>
+            <w:r>
+              <w:rPr>
+                <w:rFonts w:ascii="Times New Roman" w:cs="Times New Roman" w:eastAsia="Times New Roman" w:hAnsi="Times New Roman"/>
+                <w:b w:val="false"/>
+                <w:bCs w:val="false"/>
+                <w:color w:val="000000"/>
+                <w:sz w:val="18"/>
+                <w:szCs w:val="18"/>
+              </w:rPr>
+              <w:t xml:space="preserve">6177024</w:t>
             </w:r>
           </w:p>
         </w:tc>
@@ -540,18 +546,19 @@
       <w:tr>
         <w:tc>
           <w:tcPr>
-            <w:tcW w:type="dxa" w:w="700"/>
-            <w:tcMar>
-              <w:top w:type="dxa" w:w="55"/>
-              <w:left w:type="dxa" w:w="100"/>
-              <w:bottom w:type="dxa" w:w="55"/>
-              <w:right w:type="dxa" w:w="100"/>
-            </w:tcMar>
-            <w:vAlign w:val="center"/>
-          </w:tcPr>
-          <w:p>
-            <w:pPr>
-              <w:spacing w:after="0" w:line="240"/>
+            <w:tcW w:type="dxa" w:w="640"/>
+            <w:tcMar>
+              <w:top w:type="dxa" w:w="55"/>
+              <w:left w:type="dxa" w:w="100"/>
+              <w:bottom w:type="dxa" w:w="55"/>
+              <w:right w:type="dxa" w:w="100"/>
+            </w:tcMar>
+            <w:vAlign w:val="center"/>
+          </w:tcPr>
+          <w:p>
+            <w:pPr>
+              <w:spacing w:after="0" w:line="240"/>
+              <w:jc w:val="center"/>
             </w:pPr>
             <w:r>
               <w:rPr>
@@ -568,85 +575,87 @@
         </w:tc>
         <w:tc>
           <w:tcPr>
-            <w:tcW w:type="dxa" w:w="4520"/>
-            <w:tcMar>
-              <w:top w:type="dxa" w:w="55"/>
-              <w:left w:type="dxa" w:w="100"/>
-              <w:bottom w:type="dxa" w:w="55"/>
-              <w:right w:type="dxa" w:w="100"/>
-            </w:tcMar>
-            <w:vAlign w:val="center"/>
-          </w:tcPr>
-          <w:p>
-            <w:pPr>
-              <w:spacing w:after="0" w:line="240"/>
-            </w:pPr>
-            <w:r>
-              <w:rPr>
-                <w:rFonts w:ascii="Times New Roman" w:cs="Times New Roman" w:eastAsia="Times New Roman" w:hAnsi="Times New Roman"/>
-                <w:b w:val="false"/>
-                <w:bCs w:val="false"/>
-                <w:color w:val="000000"/>
-                <w:sz w:val="18"/>
-                <w:szCs w:val="18"/>
-              </w:rPr>
-              <w:t xml:space="preserve"/>
-            </w:r>
-          </w:p>
-        </w:tc>
-        <w:tc>
-          <w:tcPr>
-            <w:tcW w:type="dxa" w:w="1900"/>
-            <w:tcMar>
-              <w:top w:type="dxa" w:w="55"/>
-              <w:left w:type="dxa" w:w="100"/>
-              <w:bottom w:type="dxa" w:w="55"/>
-              <w:right w:type="dxa" w:w="100"/>
-            </w:tcMar>
-            <w:vAlign w:val="center"/>
-          </w:tcPr>
-          <w:p>
-            <w:pPr>
-              <w:spacing w:after="0" w:line="240"/>
-            </w:pPr>
-            <w:r>
-              <w:rPr>
-                <w:rFonts w:ascii="Times New Roman" w:cs="Times New Roman" w:eastAsia="Times New Roman" w:hAnsi="Times New Roman"/>
-                <w:b w:val="false"/>
-                <w:bCs w:val="false"/>
-                <w:color w:val="000000"/>
-                <w:sz w:val="18"/>
-                <w:szCs w:val="18"/>
-              </w:rPr>
-              <w:t xml:space="preserve"/>
-            </w:r>
-          </w:p>
-        </w:tc>
-        <w:tc>
-          <w:tcPr>
-            <w:tcW w:type="dxa" w:w="1900"/>
-            <w:tcMar>
-              <w:top w:type="dxa" w:w="55"/>
-              <w:left w:type="dxa" w:w="100"/>
-              <w:bottom w:type="dxa" w:w="55"/>
-              <w:right w:type="dxa" w:w="100"/>
-            </w:tcMar>
-            <w:vAlign w:val="center"/>
-          </w:tcPr>
-          <w:p>
-            <w:pPr>
-              <w:spacing w:after="0" w:line="240"/>
-            </w:pPr>
-            <w:r>
-              <w:rPr>
-                <w:rFonts w:ascii="Times New Roman" w:cs="Times New Roman" w:eastAsia="Times New Roman" w:hAnsi="Times New Roman"/>
-                <w:b w:val="false"/>
-                <w:bCs w:val="false"/>
-                <w:color w:val="000000"/>
-                <w:sz w:val="18"/>
-                <w:szCs w:val="18"/>
-              </w:rPr>
-              <w:t xml:space="preserve"/>
+            <w:tcW w:type="dxa" w:w="4700"/>
+            <w:tcMar>
+              <w:top w:type="dxa" w:w="55"/>
+              <w:left w:type="dxa" w:w="100"/>
+              <w:bottom w:type="dxa" w:w="55"/>
+              <w:right w:type="dxa" w:w="100"/>
+            </w:tcMar>
+            <w:vAlign w:val="center"/>
+          </w:tcPr>
+          <w:p>
+            <w:pPr>
+              <w:spacing w:after="0" w:line="240"/>
+            </w:pPr>
+            <w:r>
+              <w:rPr>
+                <w:rFonts w:ascii="Times New Roman" w:cs="Times New Roman" w:eastAsia="Times New Roman" w:hAnsi="Times New Roman"/>
+                <w:b w:val="false"/>
+                <w:bCs w:val="false"/>
+                <w:color w:val="000000"/>
+                <w:sz w:val="18"/>
+                <w:szCs w:val="18"/>
+              </w:rPr>
+              <w:t xml:space="preserve">Gahdi Eyram Ami</w:t>
+            </w:r>
+          </w:p>
+        </w:tc>
+        <w:tc>
+          <w:tcPr>
+            <w:tcW w:type="dxa" w:w="1840"/>
+            <w:tcMar>
+              <w:top w:type="dxa" w:w="55"/>
+              <w:left w:type="dxa" w:w="100"/>
+              <w:bottom w:type="dxa" w:w="55"/>
+              <w:right w:type="dxa" w:w="100"/>
+            </w:tcMar>
+            <w:vAlign w:val="center"/>
+          </w:tcPr>
+          <w:p>
+            <w:pPr>
+              <w:spacing w:after="0" w:line="240"/>
+              <w:jc w:val="center"/>
+            </w:pPr>
+            <w:r>
+              <w:rPr>
+                <w:rFonts w:ascii="Times New Roman" w:cs="Times New Roman" w:eastAsia="Times New Roman" w:hAnsi="Times New Roman"/>
+                <w:b w:val="false"/>
+                <w:bCs w:val="false"/>
+                <w:color w:val="000000"/>
+                <w:sz w:val="18"/>
+                <w:szCs w:val="18"/>
+              </w:rPr>
+              <w:t xml:space="preserve">21164328</w:t>
+            </w:r>
+          </w:p>
+        </w:tc>
+        <w:tc>
+          <w:tcPr>
+            <w:tcW w:type="dxa" w:w="1840"/>
+            <w:tcMar>
+              <w:top w:type="dxa" w:w="55"/>
+              <w:left w:type="dxa" w:w="100"/>
+              <w:bottom w:type="dxa" w:w="55"/>
+              <w:right w:type="dxa" w:w="100"/>
+            </w:tcMar>
+            <w:vAlign w:val="center"/>
+          </w:tcPr>
+          <w:p>
+            <w:pPr>
+              <w:spacing w:after="0" w:line="240"/>
+              <w:jc w:val="center"/>
+            </w:pPr>
+            <w:r>
+              <w:rPr>
+                <w:rFonts w:ascii="Times New Roman" w:cs="Times New Roman" w:eastAsia="Times New Roman" w:hAnsi="Times New Roman"/>
+                <w:b w:val="false"/>
+                <w:bCs w:val="false"/>
+                <w:color w:val="000000"/>
+                <w:sz w:val="18"/>
+                <w:szCs w:val="18"/>
+              </w:rPr>
+              <w:t xml:space="preserve">6159624</w:t>
             </w:r>
           </w:p>
         </w:tc>
@@ -654,18 +663,19 @@
       <w:tr>
         <w:tc>
           <w:tcPr>
-            <w:tcW w:type="dxa" w:w="700"/>
-            <w:tcMar>
-              <w:top w:type="dxa" w:w="55"/>
-              <w:left w:type="dxa" w:w="100"/>
-              <w:bottom w:type="dxa" w:w="55"/>
-              <w:right w:type="dxa" w:w="100"/>
-            </w:tcMar>
-            <w:vAlign w:val="center"/>
-          </w:tcPr>
-          <w:p>
-            <w:pPr>
-              <w:spacing w:after="0" w:line="240"/>
+            <w:tcW w:type="dxa" w:w="640"/>
+            <w:tcMar>
+              <w:top w:type="dxa" w:w="55"/>
+              <w:left w:type="dxa" w:w="100"/>
+              <w:bottom w:type="dxa" w:w="55"/>
+              <w:right w:type="dxa" w:w="100"/>
+            </w:tcMar>
+            <w:vAlign w:val="center"/>
+          </w:tcPr>
+          <w:p>
+            <w:pPr>
+              <w:spacing w:after="0" w:line="240"/>
+              <w:jc w:val="center"/>
             </w:pPr>
             <w:r>
               <w:rPr>
@@ -682,85 +692,87 @@
         </w:tc>
         <w:tc>
           <w:tcPr>
-            <w:tcW w:type="dxa" w:w="4520"/>
-            <w:tcMar>
-              <w:top w:type="dxa" w:w="55"/>
-              <w:left w:type="dxa" w:w="100"/>
-              <w:bottom w:type="dxa" w:w="55"/>
-              <w:right w:type="dxa" w:w="100"/>
-            </w:tcMar>
-            <w:vAlign w:val="center"/>
-          </w:tcPr>
-          <w:p>
-            <w:pPr>
-              <w:spacing w:after="0" w:line="240"/>
-            </w:pPr>
-            <w:r>
-              <w:rPr>
-                <w:rFonts w:ascii="Times New Roman" w:cs="Times New Roman" w:eastAsia="Times New Roman" w:hAnsi="Times New Roman"/>
-                <w:b w:val="false"/>
-                <w:bCs w:val="false"/>
-                <w:color w:val="000000"/>
-                <w:sz w:val="18"/>
-                <w:szCs w:val="18"/>
-              </w:rPr>
-              <w:t xml:space="preserve"/>
-            </w:r>
-          </w:p>
-        </w:tc>
-        <w:tc>
-          <w:tcPr>
-            <w:tcW w:type="dxa" w:w="1900"/>
-            <w:tcMar>
-              <w:top w:type="dxa" w:w="55"/>
-              <w:left w:type="dxa" w:w="100"/>
-              <w:bottom w:type="dxa" w:w="55"/>
-              <w:right w:type="dxa" w:w="100"/>
-            </w:tcMar>
-            <w:vAlign w:val="center"/>
-          </w:tcPr>
-          <w:p>
-            <w:pPr>
-              <w:spacing w:after="0" w:line="240"/>
-            </w:pPr>
-            <w:r>
-              <w:rPr>
-                <w:rFonts w:ascii="Times New Roman" w:cs="Times New Roman" w:eastAsia="Times New Roman" w:hAnsi="Times New Roman"/>
-                <w:b w:val="false"/>
-                <w:bCs w:val="false"/>
-                <w:color w:val="000000"/>
-                <w:sz w:val="18"/>
-                <w:szCs w:val="18"/>
-              </w:rPr>
-              <w:t xml:space="preserve"/>
-            </w:r>
-          </w:p>
-        </w:tc>
-        <w:tc>
-          <w:tcPr>
-            <w:tcW w:type="dxa" w:w="1900"/>
-            <w:tcMar>
-              <w:top w:type="dxa" w:w="55"/>
-              <w:left w:type="dxa" w:w="100"/>
-              <w:bottom w:type="dxa" w:w="55"/>
-              <w:right w:type="dxa" w:w="100"/>
-            </w:tcMar>
-            <w:vAlign w:val="center"/>
-          </w:tcPr>
-          <w:p>
-            <w:pPr>
-              <w:spacing w:after="0" w:line="240"/>
-            </w:pPr>
-            <w:r>
-              <w:rPr>
-                <w:rFonts w:ascii="Times New Roman" w:cs="Times New Roman" w:eastAsia="Times New Roman" w:hAnsi="Times New Roman"/>
-                <w:b w:val="false"/>
-                <w:bCs w:val="false"/>
-                <w:color w:val="000000"/>
-                <w:sz w:val="18"/>
-                <w:szCs w:val="18"/>
-              </w:rPr>
-              <w:t xml:space="preserve"/>
+            <w:tcW w:type="dxa" w:w="4700"/>
+            <w:tcMar>
+              <w:top w:type="dxa" w:w="55"/>
+              <w:left w:type="dxa" w:w="100"/>
+              <w:bottom w:type="dxa" w:w="55"/>
+              <w:right w:type="dxa" w:w="100"/>
+            </w:tcMar>
+            <w:vAlign w:val="center"/>
+          </w:tcPr>
+          <w:p>
+            <w:pPr>
+              <w:spacing w:after="0" w:line="240"/>
+            </w:pPr>
+            <w:r>
+              <w:rPr>
+                <w:rFonts w:ascii="Times New Roman" w:cs="Times New Roman" w:eastAsia="Times New Roman" w:hAnsi="Times New Roman"/>
+                <w:b w:val="false"/>
+                <w:bCs w:val="false"/>
+                <w:color w:val="000000"/>
+                <w:sz w:val="18"/>
+                <w:szCs w:val="18"/>
+              </w:rPr>
+              <w:t xml:space="preserve">Ohene Marvelle Ohenewah</w:t>
+            </w:r>
+          </w:p>
+        </w:tc>
+        <w:tc>
+          <w:tcPr>
+            <w:tcW w:type="dxa" w:w="1840"/>
+            <w:tcMar>
+              <w:top w:type="dxa" w:w="55"/>
+              <w:left w:type="dxa" w:w="100"/>
+              <w:bottom w:type="dxa" w:w="55"/>
+              <w:right w:type="dxa" w:w="100"/>
+            </w:tcMar>
+            <w:vAlign w:val="center"/>
+          </w:tcPr>
+          <w:p>
+            <w:pPr>
+              <w:spacing w:after="0" w:line="240"/>
+              <w:jc w:val="center"/>
+            </w:pPr>
+            <w:r>
+              <w:rPr>
+                <w:rFonts w:ascii="Times New Roman" w:cs="Times New Roman" w:eastAsia="Times New Roman" w:hAnsi="Times New Roman"/>
+                <w:b w:val="false"/>
+                <w:bCs w:val="false"/>
+                <w:color w:val="000000"/>
+                <w:sz w:val="18"/>
+                <w:szCs w:val="18"/>
+              </w:rPr>
+              <w:t xml:space="preserve">21098440</w:t>
+            </w:r>
+          </w:p>
+        </w:tc>
+        <w:tc>
+          <w:tcPr>
+            <w:tcW w:type="dxa" w:w="1840"/>
+            <w:tcMar>
+              <w:top w:type="dxa" w:w="55"/>
+              <w:left w:type="dxa" w:w="100"/>
+              <w:bottom w:type="dxa" w:w="55"/>
+              <w:right w:type="dxa" w:w="100"/>
+            </w:tcMar>
+            <w:vAlign w:val="center"/>
+          </w:tcPr>
+          <w:p>
+            <w:pPr>
+              <w:spacing w:after="0" w:line="240"/>
+              <w:jc w:val="center"/>
+            </w:pPr>
+            <w:r>
+              <w:rPr>
+                <w:rFonts w:ascii="Times New Roman" w:cs="Times New Roman" w:eastAsia="Times New Roman" w:hAnsi="Times New Roman"/>
+                <w:b w:val="false"/>
+                <w:bCs w:val="false"/>
+                <w:color w:val="000000"/>
+                <w:sz w:val="18"/>
+                <w:szCs w:val="18"/>
+              </w:rPr>
+              <w:t xml:space="preserve">6174124</w:t>
             </w:r>
           </w:p>
         </w:tc>
@@ -768,18 +780,19 @@
       <w:tr>
         <w:tc>
           <w:tcPr>
-            <w:tcW w:type="dxa" w:w="700"/>
-            <w:tcMar>
-              <w:top w:type="dxa" w:w="55"/>
-              <w:left w:type="dxa" w:w="100"/>
-              <w:bottom w:type="dxa" w:w="55"/>
-              <w:right w:type="dxa" w:w="100"/>
-            </w:tcMar>
-            <w:vAlign w:val="center"/>
-          </w:tcPr>
-          <w:p>
-            <w:pPr>
-              <w:spacing w:after="0" w:line="240"/>
+            <w:tcW w:type="dxa" w:w="640"/>
+            <w:tcMar>
+              <w:top w:type="dxa" w:w="55"/>
+              <w:left w:type="dxa" w:w="100"/>
+              <w:bottom w:type="dxa" w:w="55"/>
+              <w:right w:type="dxa" w:w="100"/>
+            </w:tcMar>
+            <w:vAlign w:val="center"/>
+          </w:tcPr>
+          <w:p>
+            <w:pPr>
+              <w:spacing w:after="0" w:line="240"/>
+              <w:jc w:val="center"/>
             </w:pPr>
             <w:r>
               <w:rPr>
@@ -796,85 +809,87 @@
         </w:tc>
         <w:tc>
           <w:tcPr>
-            <w:tcW w:type="dxa" w:w="4520"/>
-            <w:tcMar>
-              <w:top w:type="dxa" w:w="55"/>
-              <w:left w:type="dxa" w:w="100"/>
-              <w:bottom w:type="dxa" w:w="55"/>
-              <w:right w:type="dxa" w:w="100"/>
-            </w:tcMar>
-            <w:vAlign w:val="center"/>
-          </w:tcPr>
-          <w:p>
-            <w:pPr>
-              <w:spacing w:after="0" w:line="240"/>
-            </w:pPr>
-            <w:r>
-              <w:rPr>
-                <w:rFonts w:ascii="Times New Roman" w:cs="Times New Roman" w:eastAsia="Times New Roman" w:hAnsi="Times New Roman"/>
-                <w:b w:val="false"/>
-                <w:bCs w:val="false"/>
-                <w:color w:val="000000"/>
-                <w:sz w:val="18"/>
-                <w:szCs w:val="18"/>
-              </w:rPr>
-              <w:t xml:space="preserve"/>
-            </w:r>
-          </w:p>
-        </w:tc>
-        <w:tc>
-          <w:tcPr>
-            <w:tcW w:type="dxa" w:w="1900"/>
-            <w:tcMar>
-              <w:top w:type="dxa" w:w="55"/>
-              <w:left w:type="dxa" w:w="100"/>
-              <w:bottom w:type="dxa" w:w="55"/>
-              <w:right w:type="dxa" w:w="100"/>
-            </w:tcMar>
-            <w:vAlign w:val="center"/>
-          </w:tcPr>
-          <w:p>
-            <w:pPr>
-              <w:spacing w:after="0" w:line="240"/>
-            </w:pPr>
-            <w:r>
-              <w:rPr>
-                <w:rFonts w:ascii="Times New Roman" w:cs="Times New Roman" w:eastAsia="Times New Roman" w:hAnsi="Times New Roman"/>
-                <w:b w:val="false"/>
-                <w:bCs w:val="false"/>
-                <w:color w:val="000000"/>
-                <w:sz w:val="18"/>
-                <w:szCs w:val="18"/>
-              </w:rPr>
-              <w:t xml:space="preserve"/>
-            </w:r>
-          </w:p>
-        </w:tc>
-        <w:tc>
-          <w:tcPr>
-            <w:tcW w:type="dxa" w:w="1900"/>
-            <w:tcMar>
-              <w:top w:type="dxa" w:w="55"/>
-              <w:left w:type="dxa" w:w="100"/>
-              <w:bottom w:type="dxa" w:w="55"/>
-              <w:right w:type="dxa" w:w="100"/>
-            </w:tcMar>
-            <w:vAlign w:val="center"/>
-          </w:tcPr>
-          <w:p>
-            <w:pPr>
-              <w:spacing w:after="0" w:line="240"/>
-            </w:pPr>
-            <w:r>
-              <w:rPr>
-                <w:rFonts w:ascii="Times New Roman" w:cs="Times New Roman" w:eastAsia="Times New Roman" w:hAnsi="Times New Roman"/>
-                <w:b w:val="false"/>
-                <w:bCs w:val="false"/>
-                <w:color w:val="000000"/>
-                <w:sz w:val="18"/>
-                <w:szCs w:val="18"/>
-              </w:rPr>
-              <w:t xml:space="preserve"/>
+            <w:tcW w:type="dxa" w:w="4700"/>
+            <w:tcMar>
+              <w:top w:type="dxa" w:w="55"/>
+              <w:left w:type="dxa" w:w="100"/>
+              <w:bottom w:type="dxa" w:w="55"/>
+              <w:right w:type="dxa" w:w="100"/>
+            </w:tcMar>
+            <w:vAlign w:val="center"/>
+          </w:tcPr>
+          <w:p>
+            <w:pPr>
+              <w:spacing w:after="0" w:line="240"/>
+            </w:pPr>
+            <w:r>
+              <w:rPr>
+                <w:rFonts w:ascii="Times New Roman" w:cs="Times New Roman" w:eastAsia="Times New Roman" w:hAnsi="Times New Roman"/>
+                <w:b w:val="false"/>
+                <w:bCs w:val="false"/>
+                <w:color w:val="000000"/>
+                <w:sz w:val="18"/>
+                <w:szCs w:val="18"/>
+              </w:rPr>
+              <w:t xml:space="preserve">Stephen Obeng Ehureng</w:t>
+            </w:r>
+          </w:p>
+        </w:tc>
+        <w:tc>
+          <w:tcPr>
+            <w:tcW w:type="dxa" w:w="1840"/>
+            <w:tcMar>
+              <w:top w:type="dxa" w:w="55"/>
+              <w:left w:type="dxa" w:w="100"/>
+              <w:bottom w:type="dxa" w:w="55"/>
+              <w:right w:type="dxa" w:w="100"/>
+            </w:tcMar>
+            <w:vAlign w:val="center"/>
+          </w:tcPr>
+          <w:p>
+            <w:pPr>
+              <w:spacing w:after="0" w:line="240"/>
+              <w:jc w:val="center"/>
+            </w:pPr>
+            <w:r>
+              <w:rPr>
+                <w:rFonts w:ascii="Times New Roman" w:cs="Times New Roman" w:eastAsia="Times New Roman" w:hAnsi="Times New Roman"/>
+                <w:b w:val="false"/>
+                <w:bCs w:val="false"/>
+                <w:color w:val="000000"/>
+                <w:sz w:val="18"/>
+                <w:szCs w:val="18"/>
+              </w:rPr>
+              <w:t xml:space="preserve">21133301</w:t>
+            </w:r>
+          </w:p>
+        </w:tc>
+        <w:tc>
+          <w:tcPr>
+            <w:tcW w:type="dxa" w:w="1840"/>
+            <w:tcMar>
+              <w:top w:type="dxa" w:w="55"/>
+              <w:left w:type="dxa" w:w="100"/>
+              <w:bottom w:type="dxa" w:w="55"/>
+              <w:right w:type="dxa" w:w="100"/>
+            </w:tcMar>
+            <w:vAlign w:val="center"/>
+          </w:tcPr>
+          <w:p>
+            <w:pPr>
+              <w:spacing w:after="0" w:line="240"/>
+              <w:jc w:val="center"/>
+            </w:pPr>
+            <w:r>
+              <w:rPr>
+                <w:rFonts w:ascii="Times New Roman" w:cs="Times New Roman" w:eastAsia="Times New Roman" w:hAnsi="Times New Roman"/>
+                <w:b w:val="false"/>
+                <w:bCs w:val="false"/>
+                <w:color w:val="000000"/>
+                <w:sz w:val="18"/>
+                <w:szCs w:val="18"/>
+              </w:rPr>
+              <w:t xml:space="preserve">6156824</w:t>
             </w:r>
           </w:p>
         </w:tc>
@@ -882,18 +897,19 @@
       <w:tr>
         <w:tc>
           <w:tcPr>
-            <w:tcW w:type="dxa" w:w="700"/>
-            <w:tcMar>
-              <w:top w:type="dxa" w:w="55"/>
-              <w:left w:type="dxa" w:w="100"/>
-              <w:bottom w:type="dxa" w:w="55"/>
-              <w:right w:type="dxa" w:w="100"/>
-            </w:tcMar>
-            <w:vAlign w:val="center"/>
-          </w:tcPr>
-          <w:p>
-            <w:pPr>
-              <w:spacing w:after="0" w:line="240"/>
+            <w:tcW w:type="dxa" w:w="640"/>
+            <w:tcMar>
+              <w:top w:type="dxa" w:w="55"/>
+              <w:left w:type="dxa" w:w="100"/>
+              <w:bottom w:type="dxa" w:w="55"/>
+              <w:right w:type="dxa" w:w="100"/>
+            </w:tcMar>
+            <w:vAlign w:val="center"/>
+          </w:tcPr>
+          <w:p>
+            <w:pPr>
+              <w:spacing w:after="0" w:line="240"/>
+              <w:jc w:val="center"/>
             </w:pPr>
             <w:r>
               <w:rPr>
@@ -910,85 +926,87 @@
         </w:tc>
         <w:tc>
           <w:tcPr>
-            <w:tcW w:type="dxa" w:w="4520"/>
-            <w:tcMar>
-              <w:top w:type="dxa" w:w="55"/>
-              <w:left w:type="dxa" w:w="100"/>
-              <w:bottom w:type="dxa" w:w="55"/>
-              <w:right w:type="dxa" w:w="100"/>
-            </w:tcMar>
-            <w:vAlign w:val="center"/>
-          </w:tcPr>
-          <w:p>
-            <w:pPr>
-              <w:spacing w:after="0" w:line="240"/>
-            </w:pPr>
-            <w:r>
-              <w:rPr>
-                <w:rFonts w:ascii="Times New Roman" w:cs="Times New Roman" w:eastAsia="Times New Roman" w:hAnsi="Times New Roman"/>
-                <w:b w:val="false"/>
-                <w:bCs w:val="false"/>
-                <w:color w:val="000000"/>
-                <w:sz w:val="18"/>
-                <w:szCs w:val="18"/>
-              </w:rPr>
-              <w:t xml:space="preserve"/>
-            </w:r>
-          </w:p>
-        </w:tc>
-        <w:tc>
-          <w:tcPr>
-            <w:tcW w:type="dxa" w:w="1900"/>
-            <w:tcMar>
-              <w:top w:type="dxa" w:w="55"/>
-              <w:left w:type="dxa" w:w="100"/>
-              <w:bottom w:type="dxa" w:w="55"/>
-              <w:right w:type="dxa" w:w="100"/>
-            </w:tcMar>
-            <w:vAlign w:val="center"/>
-          </w:tcPr>
-          <w:p>
-            <w:pPr>
-              <w:spacing w:after="0" w:line="240"/>
-            </w:pPr>
-            <w:r>
-              <w:rPr>
-                <w:rFonts w:ascii="Times New Roman" w:cs="Times New Roman" w:eastAsia="Times New Roman" w:hAnsi="Times New Roman"/>
-                <w:b w:val="false"/>
-                <w:bCs w:val="false"/>
-                <w:color w:val="000000"/>
-                <w:sz w:val="18"/>
-                <w:szCs w:val="18"/>
-              </w:rPr>
-              <w:t xml:space="preserve"/>
-            </w:r>
-          </w:p>
-        </w:tc>
-        <w:tc>
-          <w:tcPr>
-            <w:tcW w:type="dxa" w:w="1900"/>
-            <w:tcMar>
-              <w:top w:type="dxa" w:w="55"/>
-              <w:left w:type="dxa" w:w="100"/>
-              <w:bottom w:type="dxa" w:w="55"/>
-              <w:right w:type="dxa" w:w="100"/>
-            </w:tcMar>
-            <w:vAlign w:val="center"/>
-          </w:tcPr>
-          <w:p>
-            <w:pPr>
-              <w:spacing w:after="0" w:line="240"/>
-            </w:pPr>
-            <w:r>
-              <w:rPr>
-                <w:rFonts w:ascii="Times New Roman" w:cs="Times New Roman" w:eastAsia="Times New Roman" w:hAnsi="Times New Roman"/>
-                <w:b w:val="false"/>
-                <w:bCs w:val="false"/>
-                <w:color w:val="000000"/>
-                <w:sz w:val="18"/>
-                <w:szCs w:val="18"/>
-              </w:rPr>
-              <w:t xml:space="preserve"/>
+            <w:tcW w:type="dxa" w:w="4700"/>
+            <w:tcMar>
+              <w:top w:type="dxa" w:w="55"/>
+              <w:left w:type="dxa" w:w="100"/>
+              <w:bottom w:type="dxa" w:w="55"/>
+              <w:right w:type="dxa" w:w="100"/>
+            </w:tcMar>
+            <w:vAlign w:val="center"/>
+          </w:tcPr>
+          <w:p>
+            <w:pPr>
+              <w:spacing w:after="0" w:line="240"/>
+            </w:pPr>
+            <w:r>
+              <w:rPr>
+                <w:rFonts w:ascii="Times New Roman" w:cs="Times New Roman" w:eastAsia="Times New Roman" w:hAnsi="Times New Roman"/>
+                <w:b w:val="false"/>
+                <w:bCs w:val="false"/>
+                <w:color w:val="000000"/>
+                <w:sz w:val="18"/>
+                <w:szCs w:val="18"/>
+              </w:rPr>
+              <w:t xml:space="preserve">Achen Armah Prince Charles</w:t>
+            </w:r>
+          </w:p>
+        </w:tc>
+        <w:tc>
+          <w:tcPr>
+            <w:tcW w:type="dxa" w:w="1840"/>
+            <w:tcMar>
+              <w:top w:type="dxa" w:w="55"/>
+              <w:left w:type="dxa" w:w="100"/>
+              <w:bottom w:type="dxa" w:w="55"/>
+              <w:right w:type="dxa" w:w="100"/>
+            </w:tcMar>
+            <w:vAlign w:val="center"/>
+          </w:tcPr>
+          <w:p>
+            <w:pPr>
+              <w:spacing w:after="0" w:line="240"/>
+              <w:jc w:val="center"/>
+            </w:pPr>
+            <w:r>
+              <w:rPr>
+                <w:rFonts w:ascii="Times New Roman" w:cs="Times New Roman" w:eastAsia="Times New Roman" w:hAnsi="Times New Roman"/>
+                <w:b w:val="false"/>
+                <w:bCs w:val="false"/>
+                <w:color w:val="000000"/>
+                <w:sz w:val="18"/>
+                <w:szCs w:val="18"/>
+              </w:rPr>
+              <w:t xml:space="preserve">21140389</w:t>
+            </w:r>
+          </w:p>
+        </w:tc>
+        <w:tc>
+          <w:tcPr>
+            <w:tcW w:type="dxa" w:w="1840"/>
+            <w:tcMar>
+              <w:top w:type="dxa" w:w="55"/>
+              <w:left w:type="dxa" w:w="100"/>
+              <w:bottom w:type="dxa" w:w="55"/>
+              <w:right w:type="dxa" w:w="100"/>
+            </w:tcMar>
+            <w:vAlign w:val="center"/>
+          </w:tcPr>
+          <w:p>
+            <w:pPr>
+              <w:spacing w:after="0" w:line="240"/>
+              <w:jc w:val="center"/>
+            </w:pPr>
+            <w:r>
+              <w:rPr>
+                <w:rFonts w:ascii="Times New Roman" w:cs="Times New Roman" w:eastAsia="Times New Roman" w:hAnsi="Times New Roman"/>
+                <w:b w:val="false"/>
+                <w:bCs w:val="false"/>
+                <w:color w:val="000000"/>
+                <w:sz w:val="18"/>
+                <w:szCs w:val="18"/>
+              </w:rPr>
+              <w:t xml:space="preserve">6125824</w:t>
             </w:r>
           </w:p>
         </w:tc>
@@ -996,18 +1014,19 @@
       <w:tr>
         <w:tc>
           <w:tcPr>
-            <w:tcW w:type="dxa" w:w="700"/>
-            <w:tcMar>
-              <w:top w:type="dxa" w:w="55"/>
-              <w:left w:type="dxa" w:w="100"/>
-              <w:bottom w:type="dxa" w:w="55"/>
-              <w:right w:type="dxa" w:w="100"/>
-            </w:tcMar>
-            <w:vAlign w:val="center"/>
-          </w:tcPr>
-          <w:p>
-            <w:pPr>
-              <w:spacing w:after="0" w:line="240"/>
+            <w:tcW w:type="dxa" w:w="640"/>
+            <w:tcMar>
+              <w:top w:type="dxa" w:w="55"/>
+              <w:left w:type="dxa" w:w="100"/>
+              <w:bottom w:type="dxa" w:w="55"/>
+              <w:right w:type="dxa" w:w="100"/>
+            </w:tcMar>
+            <w:vAlign w:val="center"/>
+          </w:tcPr>
+          <w:p>
+            <w:pPr>
+              <w:spacing w:after="0" w:line="240"/>
+              <w:jc w:val="center"/>
             </w:pPr>
             <w:r>
               <w:rPr>
@@ -1024,85 +1043,87 @@
         </w:tc>
         <w:tc>
           <w:tcPr>
-            <w:tcW w:type="dxa" w:w="4520"/>
-            <w:tcMar>
-              <w:top w:type="dxa" w:w="55"/>
-              <w:left w:type="dxa" w:w="100"/>
-              <w:bottom w:type="dxa" w:w="55"/>
-              <w:right w:type="dxa" w:w="100"/>
-            </w:tcMar>
-            <w:vAlign w:val="center"/>
-          </w:tcPr>
-          <w:p>
-            <w:pPr>
-              <w:spacing w:after="0" w:line="240"/>
-            </w:pPr>
-            <w:r>
-              <w:rPr>
-                <w:rFonts w:ascii="Times New Roman" w:cs="Times New Roman" w:eastAsia="Times New Roman" w:hAnsi="Times New Roman"/>
-                <w:b w:val="false"/>
-                <w:bCs w:val="false"/>
-                <w:color w:val="000000"/>
-                <w:sz w:val="18"/>
-                <w:szCs w:val="18"/>
-              </w:rPr>
-              <w:t xml:space="preserve"/>
-            </w:r>
-          </w:p>
-        </w:tc>
-        <w:tc>
-          <w:tcPr>
-            <w:tcW w:type="dxa" w:w="1900"/>
-            <w:tcMar>
-              <w:top w:type="dxa" w:w="55"/>
-              <w:left w:type="dxa" w:w="100"/>
-              <w:bottom w:type="dxa" w:w="55"/>
-              <w:right w:type="dxa" w:w="100"/>
-            </w:tcMar>
-            <w:vAlign w:val="center"/>
-          </w:tcPr>
-          <w:p>
-            <w:pPr>
-              <w:spacing w:after="0" w:line="240"/>
-            </w:pPr>
-            <w:r>
-              <w:rPr>
-                <w:rFonts w:ascii="Times New Roman" w:cs="Times New Roman" w:eastAsia="Times New Roman" w:hAnsi="Times New Roman"/>
-                <w:b w:val="false"/>
-                <w:bCs w:val="false"/>
-                <w:color w:val="000000"/>
-                <w:sz w:val="18"/>
-                <w:szCs w:val="18"/>
-              </w:rPr>
-              <w:t xml:space="preserve"/>
-            </w:r>
-          </w:p>
-        </w:tc>
-        <w:tc>
-          <w:tcPr>
-            <w:tcW w:type="dxa" w:w="1900"/>
-            <w:tcMar>
-              <w:top w:type="dxa" w:w="55"/>
-              <w:left w:type="dxa" w:w="100"/>
-              <w:bottom w:type="dxa" w:w="55"/>
-              <w:right w:type="dxa" w:w="100"/>
-            </w:tcMar>
-            <w:vAlign w:val="center"/>
-          </w:tcPr>
-          <w:p>
-            <w:pPr>
-              <w:spacing w:after="0" w:line="240"/>
-            </w:pPr>
-            <w:r>
-              <w:rPr>
-                <w:rFonts w:ascii="Times New Roman" w:cs="Times New Roman" w:eastAsia="Times New Roman" w:hAnsi="Times New Roman"/>
-                <w:b w:val="false"/>
-                <w:bCs w:val="false"/>
-                <w:color w:val="000000"/>
-                <w:sz w:val="18"/>
-                <w:szCs w:val="18"/>
-              </w:rPr>
-              <w:t xml:space="preserve"/>
+            <w:tcW w:type="dxa" w:w="4700"/>
+            <w:tcMar>
+              <w:top w:type="dxa" w:w="55"/>
+              <w:left w:type="dxa" w:w="100"/>
+              <w:bottom w:type="dxa" w:w="55"/>
+              <w:right w:type="dxa" w:w="100"/>
+            </w:tcMar>
+            <w:vAlign w:val="center"/>
+          </w:tcPr>
+          <w:p>
+            <w:pPr>
+              <w:spacing w:after="0" w:line="240"/>
+            </w:pPr>
+            <w:r>
+              <w:rPr>
+                <w:rFonts w:ascii="Times New Roman" w:cs="Times New Roman" w:eastAsia="Times New Roman" w:hAnsi="Times New Roman"/>
+                <w:b w:val="false"/>
+                <w:bCs w:val="false"/>
+                <w:color w:val="000000"/>
+                <w:sz w:val="18"/>
+                <w:szCs w:val="18"/>
+              </w:rPr>
+              <w:t xml:space="preserve">Agyei Justlord Kwame</w:t>
+            </w:r>
+          </w:p>
+        </w:tc>
+        <w:tc>
+          <w:tcPr>
+            <w:tcW w:type="dxa" w:w="1840"/>
+            <w:tcMar>
+              <w:top w:type="dxa" w:w="55"/>
+              <w:left w:type="dxa" w:w="100"/>
+              <w:bottom w:type="dxa" w:w="55"/>
+              <w:right w:type="dxa" w:w="100"/>
+            </w:tcMar>
+            <w:vAlign w:val="center"/>
+          </w:tcPr>
+          <w:p>
+            <w:pPr>
+              <w:spacing w:after="0" w:line="240"/>
+              <w:jc w:val="center"/>
+            </w:pPr>
+            <w:r>
+              <w:rPr>
+                <w:rFonts w:ascii="Times New Roman" w:cs="Times New Roman" w:eastAsia="Times New Roman" w:hAnsi="Times New Roman"/>
+                <w:b w:val="false"/>
+                <w:bCs w:val="false"/>
+                <w:color w:val="000000"/>
+                <w:sz w:val="18"/>
+                <w:szCs w:val="18"/>
+              </w:rPr>
+              <w:t xml:space="preserve">21126901</w:t>
+            </w:r>
+          </w:p>
+        </w:tc>
+        <w:tc>
+          <w:tcPr>
+            <w:tcW w:type="dxa" w:w="1840"/>
+            <w:tcMar>
+              <w:top w:type="dxa" w:w="55"/>
+              <w:left w:type="dxa" w:w="100"/>
+              <w:bottom w:type="dxa" w:w="55"/>
+              <w:right w:type="dxa" w:w="100"/>
+            </w:tcMar>
+            <w:vAlign w:val="center"/>
+          </w:tcPr>
+          <w:p>
+            <w:pPr>
+              <w:spacing w:after="0" w:line="240"/>
+              <w:jc w:val="center"/>
+            </w:pPr>
+            <w:r>
+              <w:rPr>
+                <w:rFonts w:ascii="Times New Roman" w:cs="Times New Roman" w:eastAsia="Times New Roman" w:hAnsi="Times New Roman"/>
+                <w:b w:val="false"/>
+                <w:bCs w:val="false"/>
+                <w:color w:val="000000"/>
+                <w:sz w:val="18"/>
+                <w:szCs w:val="18"/>
+              </w:rPr>
+              <w:t xml:space="preserve">6131624</w:t>
             </w:r>
           </w:p>
         </w:tc>
@@ -1110,18 +1131,19 @@
       <w:tr>
         <w:tc>
           <w:tcPr>
-            <w:tcW w:type="dxa" w:w="700"/>
-            <w:tcMar>
-              <w:top w:type="dxa" w:w="55"/>
-              <w:left w:type="dxa" w:w="100"/>
-              <w:bottom w:type="dxa" w:w="55"/>
-              <w:right w:type="dxa" w:w="100"/>
-            </w:tcMar>
-            <w:vAlign w:val="center"/>
-          </w:tcPr>
-          <w:p>
-            <w:pPr>
-              <w:spacing w:after="0" w:line="240"/>
+            <w:tcW w:type="dxa" w:w="640"/>
+            <w:tcMar>
+              <w:top w:type="dxa" w:w="55"/>
+              <w:left w:type="dxa" w:w="100"/>
+              <w:bottom w:type="dxa" w:w="55"/>
+              <w:right w:type="dxa" w:w="100"/>
+            </w:tcMar>
+            <w:vAlign w:val="center"/>
+          </w:tcPr>
+          <w:p>
+            <w:pPr>
+              <w:spacing w:after="0" w:line="240"/>
+              <w:jc w:val="center"/>
             </w:pPr>
             <w:r>
               <w:rPr>
@@ -1138,85 +1160,87 @@
         </w:tc>
         <w:tc>
           <w:tcPr>
-            <w:tcW w:type="dxa" w:w="4520"/>
-            <w:tcMar>
-              <w:top w:type="dxa" w:w="55"/>
-              <w:left w:type="dxa" w:w="100"/>
-              <w:bottom w:type="dxa" w:w="55"/>
-              <w:right w:type="dxa" w:w="100"/>
-            </w:tcMar>
-            <w:vAlign w:val="center"/>
-          </w:tcPr>
-          <w:p>
-            <w:pPr>
-              <w:spacing w:after="0" w:line="240"/>
-            </w:pPr>
-            <w:r>
-              <w:rPr>
-                <w:rFonts w:ascii="Times New Roman" w:cs="Times New Roman" w:eastAsia="Times New Roman" w:hAnsi="Times New Roman"/>
-                <w:b w:val="false"/>
-                <w:bCs w:val="false"/>
-                <w:color w:val="000000"/>
-                <w:sz w:val="18"/>
-                <w:szCs w:val="18"/>
-              </w:rPr>
-              <w:t xml:space="preserve"/>
-            </w:r>
-          </w:p>
-        </w:tc>
-        <w:tc>
-          <w:tcPr>
-            <w:tcW w:type="dxa" w:w="1900"/>
-            <w:tcMar>
-              <w:top w:type="dxa" w:w="55"/>
-              <w:left w:type="dxa" w:w="100"/>
-              <w:bottom w:type="dxa" w:w="55"/>
-              <w:right w:type="dxa" w:w="100"/>
-            </w:tcMar>
-            <w:vAlign w:val="center"/>
-          </w:tcPr>
-          <w:p>
-            <w:pPr>
-              <w:spacing w:after="0" w:line="240"/>
-            </w:pPr>
-            <w:r>
-              <w:rPr>
-                <w:rFonts w:ascii="Times New Roman" w:cs="Times New Roman" w:eastAsia="Times New Roman" w:hAnsi="Times New Roman"/>
-                <w:b w:val="false"/>
-                <w:bCs w:val="false"/>
-                <w:color w:val="000000"/>
-                <w:sz w:val="18"/>
-                <w:szCs w:val="18"/>
-              </w:rPr>
-              <w:t xml:space="preserve"/>
-            </w:r>
-          </w:p>
-        </w:tc>
-        <w:tc>
-          <w:tcPr>
-            <w:tcW w:type="dxa" w:w="1900"/>
-            <w:tcMar>
-              <w:top w:type="dxa" w:w="55"/>
-              <w:left w:type="dxa" w:w="100"/>
-              <w:bottom w:type="dxa" w:w="55"/>
-              <w:right w:type="dxa" w:w="100"/>
-            </w:tcMar>
-            <w:vAlign w:val="center"/>
-          </w:tcPr>
-          <w:p>
-            <w:pPr>
-              <w:spacing w:after="0" w:line="240"/>
-            </w:pPr>
-            <w:r>
-              <w:rPr>
-                <w:rFonts w:ascii="Times New Roman" w:cs="Times New Roman" w:eastAsia="Times New Roman" w:hAnsi="Times New Roman"/>
-                <w:b w:val="false"/>
-                <w:bCs w:val="false"/>
-                <w:color w:val="000000"/>
-                <w:sz w:val="18"/>
-                <w:szCs w:val="18"/>
-              </w:rPr>
-              <w:t xml:space="preserve"/>
+            <w:tcW w:type="dxa" w:w="4700"/>
+            <w:tcMar>
+              <w:top w:type="dxa" w:w="55"/>
+              <w:left w:type="dxa" w:w="100"/>
+              <w:bottom w:type="dxa" w:w="55"/>
+              <w:right w:type="dxa" w:w="100"/>
+            </w:tcMar>
+            <w:vAlign w:val="center"/>
+          </w:tcPr>
+          <w:p>
+            <w:pPr>
+              <w:spacing w:after="0" w:line="240"/>
+            </w:pPr>
+            <w:r>
+              <w:rPr>
+                <w:rFonts w:ascii="Times New Roman" w:cs="Times New Roman" w:eastAsia="Times New Roman" w:hAnsi="Times New Roman"/>
+                <w:b w:val="false"/>
+                <w:bCs w:val="false"/>
+                <w:color w:val="000000"/>
+                <w:sz w:val="18"/>
+                <w:szCs w:val="18"/>
+              </w:rPr>
+              <w:t xml:space="preserve">Appiagyei Boakye Jesse</w:t>
+            </w:r>
+          </w:p>
+        </w:tc>
+        <w:tc>
+          <w:tcPr>
+            <w:tcW w:type="dxa" w:w="1840"/>
+            <w:tcMar>
+              <w:top w:type="dxa" w:w="55"/>
+              <w:left w:type="dxa" w:w="100"/>
+              <w:bottom w:type="dxa" w:w="55"/>
+              <w:right w:type="dxa" w:w="100"/>
+            </w:tcMar>
+            <w:vAlign w:val="center"/>
+          </w:tcPr>
+          <w:p>
+            <w:pPr>
+              <w:spacing w:after="0" w:line="240"/>
+              <w:jc w:val="center"/>
+            </w:pPr>
+            <w:r>
+              <w:rPr>
+                <w:rFonts w:ascii="Times New Roman" w:cs="Times New Roman" w:eastAsia="Times New Roman" w:hAnsi="Times New Roman"/>
+                <w:b w:val="false"/>
+                <w:bCs w:val="false"/>
+                <w:color w:val="000000"/>
+                <w:sz w:val="18"/>
+                <w:szCs w:val="18"/>
+              </w:rPr>
+              <w:t xml:space="preserve">21074612</w:t>
+            </w:r>
+          </w:p>
+        </w:tc>
+        <w:tc>
+          <w:tcPr>
+            <w:tcW w:type="dxa" w:w="1840"/>
+            <w:tcMar>
+              <w:top w:type="dxa" w:w="55"/>
+              <w:left w:type="dxa" w:w="100"/>
+              <w:bottom w:type="dxa" w:w="55"/>
+              <w:right w:type="dxa" w:w="100"/>
+            </w:tcMar>
+            <w:vAlign w:val="center"/>
+          </w:tcPr>
+          <w:p>
+            <w:pPr>
+              <w:spacing w:after="0" w:line="240"/>
+              <w:jc w:val="center"/>
+            </w:pPr>
+            <w:r>
+              <w:rPr>
+                <w:rFonts w:ascii="Times New Roman" w:cs="Times New Roman" w:eastAsia="Times New Roman" w:hAnsi="Times New Roman"/>
+                <w:b w:val="false"/>
+                <w:bCs w:val="false"/>
+                <w:color w:val="000000"/>
+                <w:sz w:val="18"/>
+                <w:szCs w:val="18"/>
+              </w:rPr>
+              <w:t xml:space="preserve">6142524</w:t>
             </w:r>
           </w:p>
         </w:tc>
@@ -1224,18 +1248,19 @@
       <w:tr>
         <w:tc>
           <w:tcPr>
-            <w:tcW w:type="dxa" w:w="700"/>
-            <w:tcMar>
-              <w:top w:type="dxa" w:w="55"/>
-              <w:left w:type="dxa" w:w="100"/>
-              <w:bottom w:type="dxa" w:w="55"/>
-              <w:right w:type="dxa" w:w="100"/>
-            </w:tcMar>
-            <w:vAlign w:val="center"/>
-          </w:tcPr>
-          <w:p>
-            <w:pPr>
-              <w:spacing w:after="0" w:line="240"/>
+            <w:tcW w:type="dxa" w:w="640"/>
+            <w:tcMar>
+              <w:top w:type="dxa" w:w="55"/>
+              <w:left w:type="dxa" w:w="100"/>
+              <w:bottom w:type="dxa" w:w="55"/>
+              <w:right w:type="dxa" w:w="100"/>
+            </w:tcMar>
+            <w:vAlign w:val="center"/>
+          </w:tcPr>
+          <w:p>
+            <w:pPr>
+              <w:spacing w:after="0" w:line="240"/>
+              <w:jc w:val="center"/>
             </w:pPr>
             <w:r>
               <w:rPr>
@@ -1252,85 +1277,87 @@
         </w:tc>
         <w:tc>
           <w:tcPr>
-            <w:tcW w:type="dxa" w:w="4520"/>
-            <w:tcMar>
-              <w:top w:type="dxa" w:w="55"/>
-              <w:left w:type="dxa" w:w="100"/>
-              <w:bottom w:type="dxa" w:w="55"/>
-              <w:right w:type="dxa" w:w="100"/>
-            </w:tcMar>
-            <w:vAlign w:val="center"/>
-          </w:tcPr>
-          <w:p>
-            <w:pPr>
-              <w:spacing w:after="0" w:line="240"/>
-            </w:pPr>
-            <w:r>
-              <w:rPr>
-                <w:rFonts w:ascii="Times New Roman" w:cs="Times New Roman" w:eastAsia="Times New Roman" w:hAnsi="Times New Roman"/>
-                <w:b w:val="false"/>
-                <w:bCs w:val="false"/>
-                <w:color w:val="000000"/>
-                <w:sz w:val="18"/>
-                <w:szCs w:val="18"/>
-              </w:rPr>
-              <w:t xml:space="preserve"/>
-            </w:r>
-          </w:p>
-        </w:tc>
-        <w:tc>
-          <w:tcPr>
-            <w:tcW w:type="dxa" w:w="1900"/>
-            <w:tcMar>
-              <w:top w:type="dxa" w:w="55"/>
-              <w:left w:type="dxa" w:w="100"/>
-              <w:bottom w:type="dxa" w:w="55"/>
-              <w:right w:type="dxa" w:w="100"/>
-            </w:tcMar>
-            <w:vAlign w:val="center"/>
-          </w:tcPr>
-          <w:p>
-            <w:pPr>
-              <w:spacing w:after="0" w:line="240"/>
-            </w:pPr>
-            <w:r>
-              <w:rPr>
-                <w:rFonts w:ascii="Times New Roman" w:cs="Times New Roman" w:eastAsia="Times New Roman" w:hAnsi="Times New Roman"/>
-                <w:b w:val="false"/>
-                <w:bCs w:val="false"/>
-                <w:color w:val="000000"/>
-                <w:sz w:val="18"/>
-                <w:szCs w:val="18"/>
-              </w:rPr>
-              <w:t xml:space="preserve"/>
-            </w:r>
-          </w:p>
-        </w:tc>
-        <w:tc>
-          <w:tcPr>
-            <w:tcW w:type="dxa" w:w="1900"/>
-            <w:tcMar>
-              <w:top w:type="dxa" w:w="55"/>
-              <w:left w:type="dxa" w:w="100"/>
-              <w:bottom w:type="dxa" w:w="55"/>
-              <w:right w:type="dxa" w:w="100"/>
-            </w:tcMar>
-            <w:vAlign w:val="center"/>
-          </w:tcPr>
-          <w:p>
-            <w:pPr>
-              <w:spacing w:after="0" w:line="240"/>
-            </w:pPr>
-            <w:r>
-              <w:rPr>
-                <w:rFonts w:ascii="Times New Roman" w:cs="Times New Roman" w:eastAsia="Times New Roman" w:hAnsi="Times New Roman"/>
-                <w:b w:val="false"/>
-                <w:bCs w:val="false"/>
-                <w:color w:val="000000"/>
-                <w:sz w:val="18"/>
-                <w:szCs w:val="18"/>
-              </w:rPr>
-              <w:t xml:space="preserve"/>
+            <w:tcW w:type="dxa" w:w="4700"/>
+            <w:tcMar>
+              <w:top w:type="dxa" w:w="55"/>
+              <w:left w:type="dxa" w:w="100"/>
+              <w:bottom w:type="dxa" w:w="55"/>
+              <w:right w:type="dxa" w:w="100"/>
+            </w:tcMar>
+            <w:vAlign w:val="center"/>
+          </w:tcPr>
+          <w:p>
+            <w:pPr>
+              <w:spacing w:after="0" w:line="240"/>
+            </w:pPr>
+            <w:r>
+              <w:rPr>
+                <w:rFonts w:ascii="Times New Roman" w:cs="Times New Roman" w:eastAsia="Times New Roman" w:hAnsi="Times New Roman"/>
+                <w:b w:val="false"/>
+                <w:bCs w:val="false"/>
+                <w:color w:val="000000"/>
+                <w:sz w:val="18"/>
+                <w:szCs w:val="18"/>
+              </w:rPr>
+              <w:t xml:space="preserve">Asare-Sintim Hannah Blessing</w:t>
+            </w:r>
+          </w:p>
+        </w:tc>
+        <w:tc>
+          <w:tcPr>
+            <w:tcW w:type="dxa" w:w="1840"/>
+            <w:tcMar>
+              <w:top w:type="dxa" w:w="55"/>
+              <w:left w:type="dxa" w:w="100"/>
+              <w:bottom w:type="dxa" w:w="55"/>
+              <w:right w:type="dxa" w:w="100"/>
+            </w:tcMar>
+            <w:vAlign w:val="center"/>
+          </w:tcPr>
+          <w:p>
+            <w:pPr>
+              <w:spacing w:after="0" w:line="240"/>
+              <w:jc w:val="center"/>
+            </w:pPr>
+            <w:r>
+              <w:rPr>
+                <w:rFonts w:ascii="Times New Roman" w:cs="Times New Roman" w:eastAsia="Times New Roman" w:hAnsi="Times New Roman"/>
+                <w:b w:val="false"/>
+                <w:bCs w:val="false"/>
+                <w:color w:val="000000"/>
+                <w:sz w:val="18"/>
+                <w:szCs w:val="18"/>
+              </w:rPr>
+              <w:t xml:space="preserve">21187748</w:t>
+            </w:r>
+          </w:p>
+        </w:tc>
+        <w:tc>
+          <w:tcPr>
+            <w:tcW w:type="dxa" w:w="1840"/>
+            <w:tcMar>
+              <w:top w:type="dxa" w:w="55"/>
+              <w:left w:type="dxa" w:w="100"/>
+              <w:bottom w:type="dxa" w:w="55"/>
+              <w:right w:type="dxa" w:w="100"/>
+            </w:tcMar>
+            <w:vAlign w:val="center"/>
+          </w:tcPr>
+          <w:p>
+            <w:pPr>
+              <w:spacing w:after="0" w:line="240"/>
+              <w:jc w:val="center"/>
+            </w:pPr>
+            <w:r>
+              <w:rPr>
+                <w:rFonts w:ascii="Times New Roman" w:cs="Times New Roman" w:eastAsia="Times New Roman" w:hAnsi="Times New Roman"/>
+                <w:b w:val="false"/>
+                <w:bCs w:val="false"/>
+                <w:color w:val="000000"/>
+                <w:sz w:val="18"/>
+                <w:szCs w:val="18"/>
+              </w:rPr>
+              <w:t xml:space="preserve">6145124</w:t>
             </w:r>
           </w:p>
         </w:tc>
@@ -1338,18 +1365,19 @@
       <w:tr>
         <w:tc>
           <w:tcPr>
-            <w:tcW w:type="dxa" w:w="700"/>
-            <w:tcMar>
-              <w:top w:type="dxa" w:w="55"/>
-              <w:left w:type="dxa" w:w="100"/>
-              <w:bottom w:type="dxa" w:w="55"/>
-              <w:right w:type="dxa" w:w="100"/>
-            </w:tcMar>
-            <w:vAlign w:val="center"/>
-          </w:tcPr>
-          <w:p>
-            <w:pPr>
-              <w:spacing w:after="0" w:line="240"/>
+            <w:tcW w:type="dxa" w:w="640"/>
+            <w:tcMar>
+              <w:top w:type="dxa" w:w="55"/>
+              <w:left w:type="dxa" w:w="100"/>
+              <w:bottom w:type="dxa" w:w="55"/>
+              <w:right w:type="dxa" w:w="100"/>
+            </w:tcMar>
+            <w:vAlign w:val="center"/>
+          </w:tcPr>
+          <w:p>
+            <w:pPr>
+              <w:spacing w:after="0" w:line="240"/>
+              <w:jc w:val="center"/>
             </w:pPr>
             <w:r>
               <w:rPr>
@@ -1366,85 +1394,87 @@
         </w:tc>
         <w:tc>
           <w:tcPr>
-            <w:tcW w:type="dxa" w:w="4520"/>
-            <w:tcMar>
-              <w:top w:type="dxa" w:w="55"/>
-              <w:left w:type="dxa" w:w="100"/>
-              <w:bottom w:type="dxa" w:w="55"/>
-              <w:right w:type="dxa" w:w="100"/>
-            </w:tcMar>
-            <w:vAlign w:val="center"/>
-          </w:tcPr>
-          <w:p>
-            <w:pPr>
-              <w:spacing w:after="0" w:line="240"/>
-            </w:pPr>
-            <w:r>
-              <w:rPr>
-                <w:rFonts w:ascii="Times New Roman" w:cs="Times New Roman" w:eastAsia="Times New Roman" w:hAnsi="Times New Roman"/>
-                <w:b w:val="false"/>
-                <w:bCs w:val="false"/>
-                <w:color w:val="000000"/>
-                <w:sz w:val="18"/>
-                <w:szCs w:val="18"/>
-              </w:rPr>
-              <w:t xml:space="preserve"/>
-            </w:r>
-          </w:p>
-        </w:tc>
-        <w:tc>
-          <w:tcPr>
-            <w:tcW w:type="dxa" w:w="1900"/>
-            <w:tcMar>
-              <w:top w:type="dxa" w:w="55"/>
-              <w:left w:type="dxa" w:w="100"/>
-              <w:bottom w:type="dxa" w:w="55"/>
-              <w:right w:type="dxa" w:w="100"/>
-            </w:tcMar>
-            <w:vAlign w:val="center"/>
-          </w:tcPr>
-          <w:p>
-            <w:pPr>
-              <w:spacing w:after="0" w:line="240"/>
-            </w:pPr>
-            <w:r>
-              <w:rPr>
-                <w:rFonts w:ascii="Times New Roman" w:cs="Times New Roman" w:eastAsia="Times New Roman" w:hAnsi="Times New Roman"/>
-                <w:b w:val="false"/>
-                <w:bCs w:val="false"/>
-                <w:color w:val="000000"/>
-                <w:sz w:val="18"/>
-                <w:szCs w:val="18"/>
-              </w:rPr>
-              <w:t xml:space="preserve"/>
-            </w:r>
-          </w:p>
-        </w:tc>
-        <w:tc>
-          <w:tcPr>
-            <w:tcW w:type="dxa" w:w="1900"/>
-            <w:tcMar>
-              <w:top w:type="dxa" w:w="55"/>
-              <w:left w:type="dxa" w:w="100"/>
-              <w:bottom w:type="dxa" w:w="55"/>
-              <w:right w:type="dxa" w:w="100"/>
-            </w:tcMar>
-            <w:vAlign w:val="center"/>
-          </w:tcPr>
-          <w:p>
-            <w:pPr>
-              <w:spacing w:after="0" w:line="240"/>
-            </w:pPr>
-            <w:r>
-              <w:rPr>
-                <w:rFonts w:ascii="Times New Roman" w:cs="Times New Roman" w:eastAsia="Times New Roman" w:hAnsi="Times New Roman"/>
-                <w:b w:val="false"/>
-                <w:bCs w:val="false"/>
-                <w:color w:val="000000"/>
-                <w:sz w:val="18"/>
-                <w:szCs w:val="18"/>
-              </w:rPr>
-              <w:t xml:space="preserve"/>
+            <w:tcW w:type="dxa" w:w="4700"/>
+            <w:tcMar>
+              <w:top w:type="dxa" w:w="55"/>
+              <w:left w:type="dxa" w:w="100"/>
+              <w:bottom w:type="dxa" w:w="55"/>
+              <w:right w:type="dxa" w:w="100"/>
+            </w:tcMar>
+            <w:vAlign w:val="center"/>
+          </w:tcPr>
+          <w:p>
+            <w:pPr>
+              <w:spacing w:after="0" w:line="240"/>
+            </w:pPr>
+            <w:r>
+              <w:rPr>
+                <w:rFonts w:ascii="Times New Roman" w:cs="Times New Roman" w:eastAsia="Times New Roman" w:hAnsi="Times New Roman"/>
+                <w:b w:val="false"/>
+                <w:bCs w:val="false"/>
+                <w:color w:val="000000"/>
+                <w:sz w:val="18"/>
+                <w:szCs w:val="18"/>
+              </w:rPr>
+              <w:t xml:space="preserve">Jafaru Unayisu</w:t>
+            </w:r>
+          </w:p>
+        </w:tc>
+        <w:tc>
+          <w:tcPr>
+            <w:tcW w:type="dxa" w:w="1840"/>
+            <w:tcMar>
+              <w:top w:type="dxa" w:w="55"/>
+              <w:left w:type="dxa" w:w="100"/>
+              <w:bottom w:type="dxa" w:w="55"/>
+              <w:right w:type="dxa" w:w="100"/>
+            </w:tcMar>
+            <w:vAlign w:val="center"/>
+          </w:tcPr>
+          <w:p>
+            <w:pPr>
+              <w:spacing w:after="0" w:line="240"/>
+              <w:jc w:val="center"/>
+            </w:pPr>
+            <w:r>
+              <w:rPr>
+                <w:rFonts w:ascii="Times New Roman" w:cs="Times New Roman" w:eastAsia="Times New Roman" w:hAnsi="Times New Roman"/>
+                <w:b w:val="false"/>
+                <w:bCs w:val="false"/>
+                <w:color w:val="000000"/>
+                <w:sz w:val="18"/>
+                <w:szCs w:val="18"/>
+              </w:rPr>
+              <w:t xml:space="preserve">21132772</w:t>
+            </w:r>
+          </w:p>
+        </w:tc>
+        <w:tc>
+          <w:tcPr>
+            <w:tcW w:type="dxa" w:w="1840"/>
+            <w:tcMar>
+              <w:top w:type="dxa" w:w="55"/>
+              <w:left w:type="dxa" w:w="100"/>
+              <w:bottom w:type="dxa" w:w="55"/>
+              <w:right w:type="dxa" w:w="100"/>
+            </w:tcMar>
+            <w:vAlign w:val="center"/>
+          </w:tcPr>
+          <w:p>
+            <w:pPr>
+              <w:spacing w:after="0" w:line="240"/>
+              <w:jc w:val="center"/>
+            </w:pPr>
+            <w:r>
+              <w:rPr>
+                <w:rFonts w:ascii="Times New Roman" w:cs="Times New Roman" w:eastAsia="Times New Roman" w:hAnsi="Times New Roman"/>
+                <w:b w:val="false"/>
+                <w:bCs w:val="false"/>
+                <w:color w:val="000000"/>
+                <w:sz w:val="18"/>
+                <w:szCs w:val="18"/>
+              </w:rPr>
+              <w:t xml:space="preserve">6187024</w:t>
             </w:r>
           </w:p>
         </w:tc>
@@ -1452,18 +1482,19 @@
       <w:tr>
         <w:tc>
           <w:tcPr>
-            <w:tcW w:type="dxa" w:w="700"/>
-            <w:tcMar>
-              <w:top w:type="dxa" w:w="55"/>
-              <w:left w:type="dxa" w:w="100"/>
-              <w:bottom w:type="dxa" w:w="55"/>
-              <w:right w:type="dxa" w:w="100"/>
-            </w:tcMar>
-            <w:vAlign w:val="center"/>
-          </w:tcPr>
-          <w:p>
-            <w:pPr>
-              <w:spacing w:after="0" w:line="240"/>
+            <w:tcW w:type="dxa" w:w="640"/>
+            <w:tcMar>
+              <w:top w:type="dxa" w:w="55"/>
+              <w:left w:type="dxa" w:w="100"/>
+              <w:bottom w:type="dxa" w:w="55"/>
+              <w:right w:type="dxa" w:w="100"/>
+            </w:tcMar>
+            <w:vAlign w:val="center"/>
+          </w:tcPr>
+          <w:p>
+            <w:pPr>
+              <w:spacing w:after="0" w:line="240"/>
+              <w:jc w:val="center"/>
             </w:pPr>
             <w:r>
               <w:rPr>
@@ -1480,85 +1511,87 @@
         </w:tc>
         <w:tc>
           <w:tcPr>
-            <w:tcW w:type="dxa" w:w="4520"/>
-            <w:tcMar>
-              <w:top w:type="dxa" w:w="55"/>
-              <w:left w:type="dxa" w:w="100"/>
-              <w:bottom w:type="dxa" w:w="55"/>
-              <w:right w:type="dxa" w:w="100"/>
-            </w:tcMar>
-            <w:vAlign w:val="center"/>
-          </w:tcPr>
-          <w:p>
-            <w:pPr>
-              <w:spacing w:after="0" w:line="240"/>
-            </w:pPr>
-            <w:r>
-              <w:rPr>
-                <w:rFonts w:ascii="Times New Roman" w:cs="Times New Roman" w:eastAsia="Times New Roman" w:hAnsi="Times New Roman"/>
-                <w:b w:val="false"/>
-                <w:bCs w:val="false"/>
-                <w:color w:val="000000"/>
-                <w:sz w:val="18"/>
-                <w:szCs w:val="18"/>
-              </w:rPr>
-              <w:t xml:space="preserve"/>
-            </w:r>
-          </w:p>
-        </w:tc>
-        <w:tc>
-          <w:tcPr>
-            <w:tcW w:type="dxa" w:w="1900"/>
-            <w:tcMar>
-              <w:top w:type="dxa" w:w="55"/>
-              <w:left w:type="dxa" w:w="100"/>
-              <w:bottom w:type="dxa" w:w="55"/>
-              <w:right w:type="dxa" w:w="100"/>
-            </w:tcMar>
-            <w:vAlign w:val="center"/>
-          </w:tcPr>
-          <w:p>
-            <w:pPr>
-              <w:spacing w:after="0" w:line="240"/>
-            </w:pPr>
-            <w:r>
-              <w:rPr>
-                <w:rFonts w:ascii="Times New Roman" w:cs="Times New Roman" w:eastAsia="Times New Roman" w:hAnsi="Times New Roman"/>
-                <w:b w:val="false"/>
-                <w:bCs w:val="false"/>
-                <w:color w:val="000000"/>
-                <w:sz w:val="18"/>
-                <w:szCs w:val="18"/>
-              </w:rPr>
-              <w:t xml:space="preserve"/>
-            </w:r>
-          </w:p>
-        </w:tc>
-        <w:tc>
-          <w:tcPr>
-            <w:tcW w:type="dxa" w:w="1900"/>
-            <w:tcMar>
-              <w:top w:type="dxa" w:w="55"/>
-              <w:left w:type="dxa" w:w="100"/>
-              <w:bottom w:type="dxa" w:w="55"/>
-              <w:right w:type="dxa" w:w="100"/>
-            </w:tcMar>
-            <w:vAlign w:val="center"/>
-          </w:tcPr>
-          <w:p>
-            <w:pPr>
-              <w:spacing w:after="0" w:line="240"/>
-            </w:pPr>
-            <w:r>
-              <w:rPr>
-                <w:rFonts w:ascii="Times New Roman" w:cs="Times New Roman" w:eastAsia="Times New Roman" w:hAnsi="Times New Roman"/>
-                <w:b w:val="false"/>
-                <w:bCs w:val="false"/>
-                <w:color w:val="000000"/>
-                <w:sz w:val="18"/>
-                <w:szCs w:val="18"/>
-              </w:rPr>
-              <w:t xml:space="preserve"/>
+            <w:tcW w:type="dxa" w:w="4700"/>
+            <w:tcMar>
+              <w:top w:type="dxa" w:w="55"/>
+              <w:left w:type="dxa" w:w="100"/>
+              <w:bottom w:type="dxa" w:w="55"/>
+              <w:right w:type="dxa" w:w="100"/>
+            </w:tcMar>
+            <w:vAlign w:val="center"/>
+          </w:tcPr>
+          <w:p>
+            <w:pPr>
+              <w:spacing w:after="0" w:line="240"/>
+            </w:pPr>
+            <w:r>
+              <w:rPr>
+                <w:rFonts w:ascii="Times New Roman" w:cs="Times New Roman" w:eastAsia="Times New Roman" w:hAnsi="Times New Roman"/>
+                <w:b w:val="false"/>
+                <w:bCs w:val="false"/>
+                <w:color w:val="000000"/>
+                <w:sz w:val="18"/>
+                <w:szCs w:val="18"/>
+              </w:rPr>
+              <w:t xml:space="preserve">Amoah Jason David Opoku</w:t>
+            </w:r>
+          </w:p>
+        </w:tc>
+        <w:tc>
+          <w:tcPr>
+            <w:tcW w:type="dxa" w:w="1840"/>
+            <w:tcMar>
+              <w:top w:type="dxa" w:w="55"/>
+              <w:left w:type="dxa" w:w="100"/>
+              <w:bottom w:type="dxa" w:w="55"/>
+              <w:right w:type="dxa" w:w="100"/>
+            </w:tcMar>
+            <w:vAlign w:val="center"/>
+          </w:tcPr>
+          <w:p>
+            <w:pPr>
+              <w:spacing w:after="0" w:line="240"/>
+              <w:jc w:val="center"/>
+            </w:pPr>
+            <w:r>
+              <w:rPr>
+                <w:rFonts w:ascii="Times New Roman" w:cs="Times New Roman" w:eastAsia="Times New Roman" w:hAnsi="Times New Roman"/>
+                <w:b w:val="false"/>
+                <w:bCs w:val="false"/>
+                <w:color w:val="000000"/>
+                <w:sz w:val="18"/>
+                <w:szCs w:val="18"/>
+              </w:rPr>
+              <w:t xml:space="preserve">21137589</w:t>
+            </w:r>
+          </w:p>
+        </w:tc>
+        <w:tc>
+          <w:tcPr>
+            <w:tcW w:type="dxa" w:w="1840"/>
+            <w:tcMar>
+              <w:top w:type="dxa" w:w="55"/>
+              <w:left w:type="dxa" w:w="100"/>
+              <w:bottom w:type="dxa" w:w="55"/>
+              <w:right w:type="dxa" w:w="100"/>
+            </w:tcMar>
+            <w:vAlign w:val="center"/>
+          </w:tcPr>
+          <w:p>
+            <w:pPr>
+              <w:spacing w:after="0" w:line="240"/>
+              <w:jc w:val="center"/>
+            </w:pPr>
+            <w:r>
+              <w:rPr>
+                <w:rFonts w:ascii="Times New Roman" w:cs="Times New Roman" w:eastAsia="Times New Roman" w:hAnsi="Times New Roman"/>
+                <w:b w:val="false"/>
+                <w:bCs w:val="false"/>
+                <w:color w:val="000000"/>
+                <w:sz w:val="18"/>
+                <w:szCs w:val="18"/>
+              </w:rPr>
+              <w:t xml:space="preserve">6137724</w:t>
             </w:r>
           </w:p>
         </w:tc>
@@ -1566,18 +1599,19 @@
       <w:tr>
         <w:tc>
           <w:tcPr>
-            <w:tcW w:type="dxa" w:w="700"/>
-            <w:tcMar>
-              <w:top w:type="dxa" w:w="55"/>
-              <w:left w:type="dxa" w:w="100"/>
-              <w:bottom w:type="dxa" w:w="55"/>
-              <w:right w:type="dxa" w:w="100"/>
-            </w:tcMar>
-            <w:vAlign w:val="center"/>
-          </w:tcPr>
-          <w:p>
-            <w:pPr>
-              <w:spacing w:after="0" w:line="240"/>
+            <w:tcW w:type="dxa" w:w="640"/>
+            <w:tcMar>
+              <w:top w:type="dxa" w:w="55"/>
+              <w:left w:type="dxa" w:w="100"/>
+              <w:bottom w:type="dxa" w:w="55"/>
+              <w:right w:type="dxa" w:w="100"/>
+            </w:tcMar>
+            <w:vAlign w:val="center"/>
+          </w:tcPr>
+          <w:p>
+            <w:pPr>
+              <w:spacing w:after="0" w:line="240"/>
+              <w:jc w:val="center"/>
             </w:pPr>
             <w:r>
               <w:rPr>
@@ -1594,85 +1628,87 @@
         </w:tc>
         <w:tc>
           <w:tcPr>
-            <w:tcW w:type="dxa" w:w="4520"/>
-            <w:tcMar>
-              <w:top w:type="dxa" w:w="55"/>
-              <w:left w:type="dxa" w:w="100"/>
-              <w:bottom w:type="dxa" w:w="55"/>
-              <w:right w:type="dxa" w:w="100"/>
-            </w:tcMar>
-            <w:vAlign w:val="center"/>
-          </w:tcPr>
-          <w:p>
-            <w:pPr>
-              <w:spacing w:after="0" w:line="240"/>
-            </w:pPr>
-            <w:r>
-              <w:rPr>
-                <w:rFonts w:ascii="Times New Roman" w:cs="Times New Roman" w:eastAsia="Times New Roman" w:hAnsi="Times New Roman"/>
-                <w:b w:val="false"/>
-                <w:bCs w:val="false"/>
-                <w:color w:val="000000"/>
-                <w:sz w:val="18"/>
-                <w:szCs w:val="18"/>
-              </w:rPr>
-              <w:t xml:space="preserve"/>
-            </w:r>
-          </w:p>
-        </w:tc>
-        <w:tc>
-          <w:tcPr>
-            <w:tcW w:type="dxa" w:w="1900"/>
-            <w:tcMar>
-              <w:top w:type="dxa" w:w="55"/>
-              <w:left w:type="dxa" w:w="100"/>
-              <w:bottom w:type="dxa" w:w="55"/>
-              <w:right w:type="dxa" w:w="100"/>
-            </w:tcMar>
-            <w:vAlign w:val="center"/>
-          </w:tcPr>
-          <w:p>
-            <w:pPr>
-              <w:spacing w:after="0" w:line="240"/>
-            </w:pPr>
-            <w:r>
-              <w:rPr>
-                <w:rFonts w:ascii="Times New Roman" w:cs="Times New Roman" w:eastAsia="Times New Roman" w:hAnsi="Times New Roman"/>
-                <w:b w:val="false"/>
-                <w:bCs w:val="false"/>
-                <w:color w:val="000000"/>
-                <w:sz w:val="18"/>
-                <w:szCs w:val="18"/>
-              </w:rPr>
-              <w:t xml:space="preserve"/>
-            </w:r>
-          </w:p>
-        </w:tc>
-        <w:tc>
-          <w:tcPr>
-            <w:tcW w:type="dxa" w:w="1900"/>
-            <w:tcMar>
-              <w:top w:type="dxa" w:w="55"/>
-              <w:left w:type="dxa" w:w="100"/>
-              <w:bottom w:type="dxa" w:w="55"/>
-              <w:right w:type="dxa" w:w="100"/>
-            </w:tcMar>
-            <w:vAlign w:val="center"/>
-          </w:tcPr>
-          <w:p>
-            <w:pPr>
-              <w:spacing w:after="0" w:line="240"/>
-            </w:pPr>
-            <w:r>
-              <w:rPr>
-                <w:rFonts w:ascii="Times New Roman" w:cs="Times New Roman" w:eastAsia="Times New Roman" w:hAnsi="Times New Roman"/>
-                <w:b w:val="false"/>
-                <w:bCs w:val="false"/>
-                <w:color w:val="000000"/>
-                <w:sz w:val="18"/>
-                <w:szCs w:val="18"/>
-              </w:rPr>
-              <w:t xml:space="preserve"/>
+            <w:tcW w:type="dxa" w:w="4700"/>
+            <w:tcMar>
+              <w:top w:type="dxa" w:w="55"/>
+              <w:left w:type="dxa" w:w="100"/>
+              <w:bottom w:type="dxa" w:w="55"/>
+              <w:right w:type="dxa" w:w="100"/>
+            </w:tcMar>
+            <w:vAlign w:val="center"/>
+          </w:tcPr>
+          <w:p>
+            <w:pPr>
+              <w:spacing w:after="0" w:line="240"/>
+            </w:pPr>
+            <w:r>
+              <w:rPr>
+                <w:rFonts w:ascii="Times New Roman" w:cs="Times New Roman" w:eastAsia="Times New Roman" w:hAnsi="Times New Roman"/>
+                <w:b w:val="false"/>
+                <w:bCs w:val="false"/>
+                <w:color w:val="000000"/>
+                <w:sz w:val="18"/>
+                <w:szCs w:val="18"/>
+              </w:rPr>
+              <w:t xml:space="preserve">Forkuo Tervin</w:t>
+            </w:r>
+          </w:p>
+        </w:tc>
+        <w:tc>
+          <w:tcPr>
+            <w:tcW w:type="dxa" w:w="1840"/>
+            <w:tcMar>
+              <w:top w:type="dxa" w:w="55"/>
+              <w:left w:type="dxa" w:w="100"/>
+              <w:bottom w:type="dxa" w:w="55"/>
+              <w:right w:type="dxa" w:w="100"/>
+            </w:tcMar>
+            <w:vAlign w:val="center"/>
+          </w:tcPr>
+          <w:p>
+            <w:pPr>
+              <w:spacing w:after="0" w:line="240"/>
+              <w:jc w:val="center"/>
+            </w:pPr>
+            <w:r>
+              <w:rPr>
+                <w:rFonts w:ascii="Times New Roman" w:cs="Times New Roman" w:eastAsia="Times New Roman" w:hAnsi="Times New Roman"/>
+                <w:b w:val="false"/>
+                <w:bCs w:val="false"/>
+                <w:color w:val="000000"/>
+                <w:sz w:val="18"/>
+                <w:szCs w:val="18"/>
+              </w:rPr>
+              <w:t xml:space="preserve">21171066</w:t>
+            </w:r>
+          </w:p>
+        </w:tc>
+        <w:tc>
+          <w:tcPr>
+            <w:tcW w:type="dxa" w:w="1840"/>
+            <w:tcMar>
+              <w:top w:type="dxa" w:w="55"/>
+              <w:left w:type="dxa" w:w="100"/>
+              <w:bottom w:type="dxa" w:w="55"/>
+              <w:right w:type="dxa" w:w="100"/>
+            </w:tcMar>
+            <w:vAlign w:val="center"/>
+          </w:tcPr>
+          <w:p>
+            <w:pPr>
+              <w:spacing w:after="0" w:line="240"/>
+              <w:jc w:val="center"/>
+            </w:pPr>
+            <w:r>
+              <w:rPr>
+                <w:rFonts w:ascii="Times New Roman" w:cs="Times New Roman" w:eastAsia="Times New Roman" w:hAnsi="Times New Roman"/>
+                <w:b w:val="false"/>
+                <w:bCs w:val="false"/>
+                <w:color w:val="000000"/>
+                <w:sz w:val="18"/>
+                <w:szCs w:val="18"/>
+              </w:rPr>
+              <w:t xml:space="preserve">6158424</w:t>
             </w:r>
           </w:p>
         </w:tc>
@@ -1680,18 +1716,19 @@
       <w:tr>
         <w:tc>
           <w:tcPr>
-            <w:tcW w:type="dxa" w:w="700"/>
-            <w:tcMar>
-              <w:top w:type="dxa" w:w="55"/>
-              <w:left w:type="dxa" w:w="100"/>
-              <w:bottom w:type="dxa" w:w="55"/>
-              <w:right w:type="dxa" w:w="100"/>
-            </w:tcMar>
-            <w:vAlign w:val="center"/>
-          </w:tcPr>
-          <w:p>
-            <w:pPr>
-              <w:spacing w:after="0" w:line="240"/>
+            <w:tcW w:type="dxa" w:w="640"/>
+            <w:tcMar>
+              <w:top w:type="dxa" w:w="55"/>
+              <w:left w:type="dxa" w:w="100"/>
+              <w:bottom w:type="dxa" w:w="55"/>
+              <w:right w:type="dxa" w:w="100"/>
+            </w:tcMar>
+            <w:vAlign w:val="center"/>
+          </w:tcPr>
+          <w:p>
+            <w:pPr>
+              <w:spacing w:after="0" w:line="240"/>
+              <w:jc w:val="center"/>
             </w:pPr>
             <w:r>
               <w:rPr>
@@ -1708,85 +1745,87 @@
         </w:tc>
         <w:tc>
           <w:tcPr>
-            <w:tcW w:type="dxa" w:w="4520"/>
-            <w:tcMar>
-              <w:top w:type="dxa" w:w="55"/>
-              <w:left w:type="dxa" w:w="100"/>
-              <w:bottom w:type="dxa" w:w="55"/>
-              <w:right w:type="dxa" w:w="100"/>
-            </w:tcMar>
-            <w:vAlign w:val="center"/>
-          </w:tcPr>
-          <w:p>
-            <w:pPr>
-              <w:spacing w:after="0" w:line="240"/>
-            </w:pPr>
-            <w:r>
-              <w:rPr>
-                <w:rFonts w:ascii="Times New Roman" w:cs="Times New Roman" w:eastAsia="Times New Roman" w:hAnsi="Times New Roman"/>
-                <w:b w:val="false"/>
-                <w:bCs w:val="false"/>
-                <w:color w:val="000000"/>
-                <w:sz w:val="18"/>
-                <w:szCs w:val="18"/>
-              </w:rPr>
-              <w:t xml:space="preserve"/>
-            </w:r>
-          </w:p>
-        </w:tc>
-        <w:tc>
-          <w:tcPr>
-            <w:tcW w:type="dxa" w:w="1900"/>
-            <w:tcMar>
-              <w:top w:type="dxa" w:w="55"/>
-              <w:left w:type="dxa" w:w="100"/>
-              <w:bottom w:type="dxa" w:w="55"/>
-              <w:right w:type="dxa" w:w="100"/>
-            </w:tcMar>
-            <w:vAlign w:val="center"/>
-          </w:tcPr>
-          <w:p>
-            <w:pPr>
-              <w:spacing w:after="0" w:line="240"/>
-            </w:pPr>
-            <w:r>
-              <w:rPr>
-                <w:rFonts w:ascii="Times New Roman" w:cs="Times New Roman" w:eastAsia="Times New Roman" w:hAnsi="Times New Roman"/>
-                <w:b w:val="false"/>
-                <w:bCs w:val="false"/>
-                <w:color w:val="000000"/>
-                <w:sz w:val="18"/>
-                <w:szCs w:val="18"/>
-              </w:rPr>
-              <w:t xml:space="preserve"/>
-            </w:r>
-          </w:p>
-        </w:tc>
-        <w:tc>
-          <w:tcPr>
-            <w:tcW w:type="dxa" w:w="1900"/>
-            <w:tcMar>
-              <w:top w:type="dxa" w:w="55"/>
-              <w:left w:type="dxa" w:w="100"/>
-              <w:bottom w:type="dxa" w:w="55"/>
-              <w:right w:type="dxa" w:w="100"/>
-            </w:tcMar>
-            <w:vAlign w:val="center"/>
-          </w:tcPr>
-          <w:p>
-            <w:pPr>
-              <w:spacing w:after="0" w:line="240"/>
-            </w:pPr>
-            <w:r>
-              <w:rPr>
-                <w:rFonts w:ascii="Times New Roman" w:cs="Times New Roman" w:eastAsia="Times New Roman" w:hAnsi="Times New Roman"/>
-                <w:b w:val="false"/>
-                <w:bCs w:val="false"/>
-                <w:color w:val="000000"/>
-                <w:sz w:val="18"/>
-                <w:szCs w:val="18"/>
-              </w:rPr>
-              <w:t xml:space="preserve"/>
+            <w:tcW w:type="dxa" w:w="4700"/>
+            <w:tcMar>
+              <w:top w:type="dxa" w:w="55"/>
+              <w:left w:type="dxa" w:w="100"/>
+              <w:bottom w:type="dxa" w:w="55"/>
+              <w:right w:type="dxa" w:w="100"/>
+            </w:tcMar>
+            <w:vAlign w:val="center"/>
+          </w:tcPr>
+          <w:p>
+            <w:pPr>
+              <w:spacing w:after="0" w:line="240"/>
+            </w:pPr>
+            <w:r>
+              <w:rPr>
+                <w:rFonts w:ascii="Times New Roman" w:cs="Times New Roman" w:eastAsia="Times New Roman" w:hAnsi="Times New Roman"/>
+                <w:b w:val="false"/>
+                <w:bCs w:val="false"/>
+                <w:color w:val="000000"/>
+                <w:sz w:val="18"/>
+                <w:szCs w:val="18"/>
+              </w:rPr>
+              <w:t xml:space="preserve">Dramani Emmanuel</w:t>
+            </w:r>
+          </w:p>
+        </w:tc>
+        <w:tc>
+          <w:tcPr>
+            <w:tcW w:type="dxa" w:w="1840"/>
+            <w:tcMar>
+              <w:top w:type="dxa" w:w="55"/>
+              <w:left w:type="dxa" w:w="100"/>
+              <w:bottom w:type="dxa" w:w="55"/>
+              <w:right w:type="dxa" w:w="100"/>
+            </w:tcMar>
+            <w:vAlign w:val="center"/>
+          </w:tcPr>
+          <w:p>
+            <w:pPr>
+              <w:spacing w:after="0" w:line="240"/>
+              <w:jc w:val="center"/>
+            </w:pPr>
+            <w:r>
+              <w:rPr>
+                <w:rFonts w:ascii="Times New Roman" w:cs="Times New Roman" w:eastAsia="Times New Roman" w:hAnsi="Times New Roman"/>
+                <w:b w:val="false"/>
+                <w:bCs w:val="false"/>
+                <w:color w:val="000000"/>
+                <w:sz w:val="18"/>
+                <w:szCs w:val="18"/>
+              </w:rPr>
+              <w:t xml:space="preserve">21174488</w:t>
+            </w:r>
+          </w:p>
+        </w:tc>
+        <w:tc>
+          <w:tcPr>
+            <w:tcW w:type="dxa" w:w="1840"/>
+            <w:tcMar>
+              <w:top w:type="dxa" w:w="55"/>
+              <w:left w:type="dxa" w:w="100"/>
+              <w:bottom w:type="dxa" w:w="55"/>
+              <w:right w:type="dxa" w:w="100"/>
+            </w:tcMar>
+            <w:vAlign w:val="center"/>
+          </w:tcPr>
+          <w:p>
+            <w:pPr>
+              <w:spacing w:after="0" w:line="240"/>
+              <w:jc w:val="center"/>
+            </w:pPr>
+            <w:r>
+              <w:rPr>
+                <w:rFonts w:ascii="Times New Roman" w:cs="Times New Roman" w:eastAsia="Times New Roman" w:hAnsi="Times New Roman"/>
+                <w:b w:val="false"/>
+                <w:bCs w:val="false"/>
+                <w:color w:val="000000"/>
+                <w:sz w:val="18"/>
+                <w:szCs w:val="18"/>
+              </w:rPr>
+              <w:t xml:space="preserve">6155624</w:t>
             </w:r>
           </w:p>
         </w:tc>
@@ -1794,18 +1833,19 @@
       <w:tr>
         <w:tc>
           <w:tcPr>
-            <w:tcW w:type="dxa" w:w="700"/>
-            <w:tcMar>
-              <w:top w:type="dxa" w:w="55"/>
-              <w:left w:type="dxa" w:w="100"/>
-              <w:bottom w:type="dxa" w:w="55"/>
-              <w:right w:type="dxa" w:w="100"/>
-            </w:tcMar>
-            <w:vAlign w:val="center"/>
-          </w:tcPr>
-          <w:p>
-            <w:pPr>
-              <w:spacing w:after="0" w:line="240"/>
+            <w:tcW w:type="dxa" w:w="640"/>
+            <w:tcMar>
+              <w:top w:type="dxa" w:w="55"/>
+              <w:left w:type="dxa" w:w="100"/>
+              <w:bottom w:type="dxa" w:w="55"/>
+              <w:right w:type="dxa" w:w="100"/>
+            </w:tcMar>
+            <w:vAlign w:val="center"/>
+          </w:tcPr>
+          <w:p>
+            <w:pPr>
+              <w:spacing w:after="0" w:line="240"/>
+              <w:jc w:val="center"/>
             </w:pPr>
             <w:r>
               <w:rPr>
@@ -1822,85 +1862,87 @@
         </w:tc>
         <w:tc>
           <w:tcPr>
-            <w:tcW w:type="dxa" w:w="4520"/>
-            <w:tcMar>
-              <w:top w:type="dxa" w:w="55"/>
-              <w:left w:type="dxa" w:w="100"/>
-              <w:bottom w:type="dxa" w:w="55"/>
-              <w:right w:type="dxa" w:w="100"/>
-            </w:tcMar>
-            <w:vAlign w:val="center"/>
-          </w:tcPr>
-          <w:p>
-            <w:pPr>
-              <w:spacing w:after="0" w:line="240"/>
-            </w:pPr>
-            <w:r>
-              <w:rPr>
-                <w:rFonts w:ascii="Times New Roman" w:cs="Times New Roman" w:eastAsia="Times New Roman" w:hAnsi="Times New Roman"/>
-                <w:b w:val="false"/>
-                <w:bCs w:val="false"/>
-                <w:color w:val="000000"/>
-                <w:sz w:val="18"/>
-                <w:szCs w:val="18"/>
-              </w:rPr>
-              <w:t xml:space="preserve"/>
-            </w:r>
-          </w:p>
-        </w:tc>
-        <w:tc>
-          <w:tcPr>
-            <w:tcW w:type="dxa" w:w="1900"/>
-            <w:tcMar>
-              <w:top w:type="dxa" w:w="55"/>
-              <w:left w:type="dxa" w:w="100"/>
-              <w:bottom w:type="dxa" w:w="55"/>
-              <w:right w:type="dxa" w:w="100"/>
-            </w:tcMar>
-            <w:vAlign w:val="center"/>
-          </w:tcPr>
-          <w:p>
-            <w:pPr>
-              <w:spacing w:after="0" w:line="240"/>
-            </w:pPr>
-            <w:r>
-              <w:rPr>
-                <w:rFonts w:ascii="Times New Roman" w:cs="Times New Roman" w:eastAsia="Times New Roman" w:hAnsi="Times New Roman"/>
-                <w:b w:val="false"/>
-                <w:bCs w:val="false"/>
-                <w:color w:val="000000"/>
-                <w:sz w:val="18"/>
-                <w:szCs w:val="18"/>
-              </w:rPr>
-              <w:t xml:space="preserve"/>
-            </w:r>
-          </w:p>
-        </w:tc>
-        <w:tc>
-          <w:tcPr>
-            <w:tcW w:type="dxa" w:w="1900"/>
-            <w:tcMar>
-              <w:top w:type="dxa" w:w="55"/>
-              <w:left w:type="dxa" w:w="100"/>
-              <w:bottom w:type="dxa" w:w="55"/>
-              <w:right w:type="dxa" w:w="100"/>
-            </w:tcMar>
-            <w:vAlign w:val="center"/>
-          </w:tcPr>
-          <w:p>
-            <w:pPr>
-              <w:spacing w:after="0" w:line="240"/>
-            </w:pPr>
-            <w:r>
-              <w:rPr>
-                <w:rFonts w:ascii="Times New Roman" w:cs="Times New Roman" w:eastAsia="Times New Roman" w:hAnsi="Times New Roman"/>
-                <w:b w:val="false"/>
-                <w:bCs w:val="false"/>
-                <w:color w:val="000000"/>
-                <w:sz w:val="18"/>
-                <w:szCs w:val="18"/>
-              </w:rPr>
-              <w:t xml:space="preserve"/>
+            <w:tcW w:type="dxa" w:w="4700"/>
+            <w:tcMar>
+              <w:top w:type="dxa" w:w="55"/>
+              <w:left w:type="dxa" w:w="100"/>
+              <w:bottom w:type="dxa" w:w="55"/>
+              <w:right w:type="dxa" w:w="100"/>
+            </w:tcMar>
+            <w:vAlign w:val="center"/>
+          </w:tcPr>
+          <w:p>
+            <w:pPr>
+              <w:spacing w:after="0" w:line="240"/>
+            </w:pPr>
+            <w:r>
+              <w:rPr>
+                <w:rFonts w:ascii="Times New Roman" w:cs="Times New Roman" w:eastAsia="Times New Roman" w:hAnsi="Times New Roman"/>
+                <w:b w:val="false"/>
+                <w:bCs w:val="false"/>
+                <w:color w:val="000000"/>
+                <w:sz w:val="18"/>
+                <w:szCs w:val="18"/>
+              </w:rPr>
+              <w:t xml:space="preserve">Mireku Ohene Yaw</w:t>
+            </w:r>
+          </w:p>
+        </w:tc>
+        <w:tc>
+          <w:tcPr>
+            <w:tcW w:type="dxa" w:w="1840"/>
+            <w:tcMar>
+              <w:top w:type="dxa" w:w="55"/>
+              <w:left w:type="dxa" w:w="100"/>
+              <w:bottom w:type="dxa" w:w="55"/>
+              <w:right w:type="dxa" w:w="100"/>
+            </w:tcMar>
+            <w:vAlign w:val="center"/>
+          </w:tcPr>
+          <w:p>
+            <w:pPr>
+              <w:spacing w:after="0" w:line="240"/>
+              <w:jc w:val="center"/>
+            </w:pPr>
+            <w:r>
+              <w:rPr>
+                <w:rFonts w:ascii="Times New Roman" w:cs="Times New Roman" w:eastAsia="Times New Roman" w:hAnsi="Times New Roman"/>
+                <w:b w:val="false"/>
+                <w:bCs w:val="false"/>
+                <w:color w:val="000000"/>
+                <w:sz w:val="18"/>
+                <w:szCs w:val="18"/>
+              </w:rPr>
+              <w:t xml:space="preserve">21167508</w:t>
+            </w:r>
+          </w:p>
+        </w:tc>
+        <w:tc>
+          <w:tcPr>
+            <w:tcW w:type="dxa" w:w="1840"/>
+            <w:tcMar>
+              <w:top w:type="dxa" w:w="55"/>
+              <w:left w:type="dxa" w:w="100"/>
+              <w:bottom w:type="dxa" w:w="55"/>
+              <w:right w:type="dxa" w:w="100"/>
+            </w:tcMar>
+            <w:vAlign w:val="center"/>
+          </w:tcPr>
+          <w:p>
+            <w:pPr>
+              <w:spacing w:after="0" w:line="240"/>
+              <w:jc w:val="center"/>
+            </w:pPr>
+            <w:r>
+              <w:rPr>
+                <w:rFonts w:ascii="Times New Roman" w:cs="Times New Roman" w:eastAsia="Times New Roman" w:hAnsi="Times New Roman"/>
+                <w:b w:val="false"/>
+                <w:bCs w:val="false"/>
+                <w:color w:val="000000"/>
+                <w:sz w:val="18"/>
+                <w:szCs w:val="18"/>
+              </w:rPr>
+              <w:t xml:space="preserve">6168924</w:t>
             </w:r>
           </w:p>
         </w:tc>
@@ -1908,18 +1950,19 @@
       <w:tr>
         <w:tc>
           <w:tcPr>
-            <w:tcW w:type="dxa" w:w="700"/>
-            <w:tcMar>
-              <w:top w:type="dxa" w:w="55"/>
-              <w:left w:type="dxa" w:w="100"/>
-              <w:bottom w:type="dxa" w:w="55"/>
-              <w:right w:type="dxa" w:w="100"/>
-            </w:tcMar>
-            <w:vAlign w:val="center"/>
-          </w:tcPr>
-          <w:p>
-            <w:pPr>
-              <w:spacing w:after="0" w:line="240"/>
+            <w:tcW w:type="dxa" w:w="640"/>
+            <w:tcMar>
+              <w:top w:type="dxa" w:w="55"/>
+              <w:left w:type="dxa" w:w="100"/>
+              <w:bottom w:type="dxa" w:w="55"/>
+              <w:right w:type="dxa" w:w="100"/>
+            </w:tcMar>
+            <w:vAlign w:val="center"/>
+          </w:tcPr>
+          <w:p>
+            <w:pPr>
+              <w:spacing w:after="0" w:line="240"/>
+              <w:jc w:val="center"/>
             </w:pPr>
             <w:r>
               <w:rPr>
@@ -1936,85 +1979,87 @@
         </w:tc>
         <w:tc>
           <w:tcPr>
-            <w:tcW w:type="dxa" w:w="4520"/>
-            <w:tcMar>
-              <w:top w:type="dxa" w:w="55"/>
-              <w:left w:type="dxa" w:w="100"/>
-              <w:bottom w:type="dxa" w:w="55"/>
-              <w:right w:type="dxa" w:w="100"/>
-            </w:tcMar>
-            <w:vAlign w:val="center"/>
-          </w:tcPr>
-          <w:p>
-            <w:pPr>
-              <w:spacing w:after="0" w:line="240"/>
-            </w:pPr>
-            <w:r>
-              <w:rPr>
-                <w:rFonts w:ascii="Times New Roman" w:cs="Times New Roman" w:eastAsia="Times New Roman" w:hAnsi="Times New Roman"/>
-                <w:b w:val="false"/>
-                <w:bCs w:val="false"/>
-                <w:color w:val="000000"/>
-                <w:sz w:val="18"/>
-                <w:szCs w:val="18"/>
-              </w:rPr>
-              <w:t xml:space="preserve"/>
-            </w:r>
-          </w:p>
-        </w:tc>
-        <w:tc>
-          <w:tcPr>
-            <w:tcW w:type="dxa" w:w="1900"/>
-            <w:tcMar>
-              <w:top w:type="dxa" w:w="55"/>
-              <w:left w:type="dxa" w:w="100"/>
-              <w:bottom w:type="dxa" w:w="55"/>
-              <w:right w:type="dxa" w:w="100"/>
-            </w:tcMar>
-            <w:vAlign w:val="center"/>
-          </w:tcPr>
-          <w:p>
-            <w:pPr>
-              <w:spacing w:after="0" w:line="240"/>
-            </w:pPr>
-            <w:r>
-              <w:rPr>
-                <w:rFonts w:ascii="Times New Roman" w:cs="Times New Roman" w:eastAsia="Times New Roman" w:hAnsi="Times New Roman"/>
-                <w:b w:val="false"/>
-                <w:bCs w:val="false"/>
-                <w:color w:val="000000"/>
-                <w:sz w:val="18"/>
-                <w:szCs w:val="18"/>
-              </w:rPr>
-              <w:t xml:space="preserve"/>
-            </w:r>
-          </w:p>
-        </w:tc>
-        <w:tc>
-          <w:tcPr>
-            <w:tcW w:type="dxa" w:w="1900"/>
-            <w:tcMar>
-              <w:top w:type="dxa" w:w="55"/>
-              <w:left w:type="dxa" w:w="100"/>
-              <w:bottom w:type="dxa" w:w="55"/>
-              <w:right w:type="dxa" w:w="100"/>
-            </w:tcMar>
-            <w:vAlign w:val="center"/>
-          </w:tcPr>
-          <w:p>
-            <w:pPr>
-              <w:spacing w:after="0" w:line="240"/>
-            </w:pPr>
-            <w:r>
-              <w:rPr>
-                <w:rFonts w:ascii="Times New Roman" w:cs="Times New Roman" w:eastAsia="Times New Roman" w:hAnsi="Times New Roman"/>
-                <w:b w:val="false"/>
-                <w:bCs w:val="false"/>
-                <w:color w:val="000000"/>
-                <w:sz w:val="18"/>
-                <w:szCs w:val="18"/>
-              </w:rPr>
-              <w:t xml:space="preserve"/>
+            <w:tcW w:type="dxa" w:w="4700"/>
+            <w:tcMar>
+              <w:top w:type="dxa" w:w="55"/>
+              <w:left w:type="dxa" w:w="100"/>
+              <w:bottom w:type="dxa" w:w="55"/>
+              <w:right w:type="dxa" w:w="100"/>
+            </w:tcMar>
+            <w:vAlign w:val="center"/>
+          </w:tcPr>
+          <w:p>
+            <w:pPr>
+              <w:spacing w:after="0" w:line="240"/>
+            </w:pPr>
+            <w:r>
+              <w:rPr>
+                <w:rFonts w:ascii="Times New Roman" w:cs="Times New Roman" w:eastAsia="Times New Roman" w:hAnsi="Times New Roman"/>
+                <w:b w:val="false"/>
+                <w:bCs w:val="false"/>
+                <w:color w:val="000000"/>
+                <w:sz w:val="18"/>
+                <w:szCs w:val="18"/>
+              </w:rPr>
+              <w:t xml:space="preserve">Onwe Angel Favour Chiamaka</w:t>
+            </w:r>
+          </w:p>
+        </w:tc>
+        <w:tc>
+          <w:tcPr>
+            <w:tcW w:type="dxa" w:w="1840"/>
+            <w:tcMar>
+              <w:top w:type="dxa" w:w="55"/>
+              <w:left w:type="dxa" w:w="100"/>
+              <w:bottom w:type="dxa" w:w="55"/>
+              <w:right w:type="dxa" w:w="100"/>
+            </w:tcMar>
+            <w:vAlign w:val="center"/>
+          </w:tcPr>
+          <w:p>
+            <w:pPr>
+              <w:spacing w:after="0" w:line="240"/>
+              <w:jc w:val="center"/>
+            </w:pPr>
+            <w:r>
+              <w:rPr>
+                <w:rFonts w:ascii="Times New Roman" w:cs="Times New Roman" w:eastAsia="Times New Roman" w:hAnsi="Times New Roman"/>
+                <w:b w:val="false"/>
+                <w:bCs w:val="false"/>
+                <w:color w:val="000000"/>
+                <w:sz w:val="18"/>
+                <w:szCs w:val="18"/>
+              </w:rPr>
+              <w:t xml:space="preserve">21170635</w:t>
+            </w:r>
+          </w:p>
+        </w:tc>
+        <w:tc>
+          <w:tcPr>
+            <w:tcW w:type="dxa" w:w="1840"/>
+            <w:tcMar>
+              <w:top w:type="dxa" w:w="55"/>
+              <w:left w:type="dxa" w:w="100"/>
+              <w:bottom w:type="dxa" w:w="55"/>
+              <w:right w:type="dxa" w:w="100"/>
+            </w:tcMar>
+            <w:vAlign w:val="center"/>
+          </w:tcPr>
+          <w:p>
+            <w:pPr>
+              <w:spacing w:after="0" w:line="240"/>
+              <w:jc w:val="center"/>
+            </w:pPr>
+            <w:r>
+              <w:rPr>
+                <w:rFonts w:ascii="Times New Roman" w:cs="Times New Roman" w:eastAsia="Times New Roman" w:hAnsi="Times New Roman"/>
+                <w:b w:val="false"/>
+                <w:bCs w:val="false"/>
+                <w:color w:val="000000"/>
+                <w:sz w:val="18"/>
+                <w:szCs w:val="18"/>
+              </w:rPr>
+              <w:t xml:space="preserve">6175024</w:t>
             </w:r>
           </w:p>
         </w:tc>
@@ -2022,18 +2067,19 @@
       <w:tr>
         <w:tc>
           <w:tcPr>
-            <w:tcW w:type="dxa" w:w="700"/>
-            <w:tcMar>
-              <w:top w:type="dxa" w:w="55"/>
-              <w:left w:type="dxa" w:w="100"/>
-              <w:bottom w:type="dxa" w:w="55"/>
-              <w:right w:type="dxa" w:w="100"/>
-            </w:tcMar>
-            <w:vAlign w:val="center"/>
-          </w:tcPr>
-          <w:p>
-            <w:pPr>
-              <w:spacing w:after="0" w:line="240"/>
+            <w:tcW w:type="dxa" w:w="640"/>
+            <w:tcMar>
+              <w:top w:type="dxa" w:w="55"/>
+              <w:left w:type="dxa" w:w="100"/>
+              <w:bottom w:type="dxa" w:w="55"/>
+              <w:right w:type="dxa" w:w="100"/>
+            </w:tcMar>
+            <w:vAlign w:val="center"/>
+          </w:tcPr>
+          <w:p>
+            <w:pPr>
+              <w:spacing w:after="0" w:line="240"/>
+              <w:jc w:val="center"/>
             </w:pPr>
             <w:r>
               <w:rPr>
@@ -2050,85 +2096,87 @@
         </w:tc>
         <w:tc>
           <w:tcPr>
-            <w:tcW w:type="dxa" w:w="4520"/>
-            <w:tcMar>
-              <w:top w:type="dxa" w:w="55"/>
-              <w:left w:type="dxa" w:w="100"/>
-              <w:bottom w:type="dxa" w:w="55"/>
-              <w:right w:type="dxa" w:w="100"/>
-            </w:tcMar>
-            <w:vAlign w:val="center"/>
-          </w:tcPr>
-          <w:p>
-            <w:pPr>
-              <w:spacing w:after="0" w:line="240"/>
-            </w:pPr>
-            <w:r>
-              <w:rPr>
-                <w:rFonts w:ascii="Times New Roman" w:cs="Times New Roman" w:eastAsia="Times New Roman" w:hAnsi="Times New Roman"/>
-                <w:b w:val="false"/>
-                <w:bCs w:val="false"/>
-                <w:color w:val="000000"/>
-                <w:sz w:val="18"/>
-                <w:szCs w:val="18"/>
-              </w:rPr>
-              <w:t xml:space="preserve"/>
-            </w:r>
-          </w:p>
-        </w:tc>
-        <w:tc>
-          <w:tcPr>
-            <w:tcW w:type="dxa" w:w="1900"/>
-            <w:tcMar>
-              <w:top w:type="dxa" w:w="55"/>
-              <w:left w:type="dxa" w:w="100"/>
-              <w:bottom w:type="dxa" w:w="55"/>
-              <w:right w:type="dxa" w:w="100"/>
-            </w:tcMar>
-            <w:vAlign w:val="center"/>
-          </w:tcPr>
-          <w:p>
-            <w:pPr>
-              <w:spacing w:after="0" w:line="240"/>
-            </w:pPr>
-            <w:r>
-              <w:rPr>
-                <w:rFonts w:ascii="Times New Roman" w:cs="Times New Roman" w:eastAsia="Times New Roman" w:hAnsi="Times New Roman"/>
-                <w:b w:val="false"/>
-                <w:bCs w:val="false"/>
-                <w:color w:val="000000"/>
-                <w:sz w:val="18"/>
-                <w:szCs w:val="18"/>
-              </w:rPr>
-              <w:t xml:space="preserve"/>
-            </w:r>
-          </w:p>
-        </w:tc>
-        <w:tc>
-          <w:tcPr>
-            <w:tcW w:type="dxa" w:w="1900"/>
-            <w:tcMar>
-              <w:top w:type="dxa" w:w="55"/>
-              <w:left w:type="dxa" w:w="100"/>
-              <w:bottom w:type="dxa" w:w="55"/>
-              <w:right w:type="dxa" w:w="100"/>
-            </w:tcMar>
-            <w:vAlign w:val="center"/>
-          </w:tcPr>
-          <w:p>
-            <w:pPr>
-              <w:spacing w:after="0" w:line="240"/>
-            </w:pPr>
-            <w:r>
-              <w:rPr>
-                <w:rFonts w:ascii="Times New Roman" w:cs="Times New Roman" w:eastAsia="Times New Roman" w:hAnsi="Times New Roman"/>
-                <w:b w:val="false"/>
-                <w:bCs w:val="false"/>
-                <w:color w:val="000000"/>
-                <w:sz w:val="18"/>
-                <w:szCs w:val="18"/>
-              </w:rPr>
-              <w:t xml:space="preserve"/>
+            <w:tcW w:type="dxa" w:w="4700"/>
+            <w:tcMar>
+              <w:top w:type="dxa" w:w="55"/>
+              <w:left w:type="dxa" w:w="100"/>
+              <w:bottom w:type="dxa" w:w="55"/>
+              <w:right w:type="dxa" w:w="100"/>
+            </w:tcMar>
+            <w:vAlign w:val="center"/>
+          </w:tcPr>
+          <w:p>
+            <w:pPr>
+              <w:spacing w:after="0" w:line="240"/>
+            </w:pPr>
+            <w:r>
+              <w:rPr>
+                <w:rFonts w:ascii="Times New Roman" w:cs="Times New Roman" w:eastAsia="Times New Roman" w:hAnsi="Times New Roman"/>
+                <w:b w:val="false"/>
+                <w:bCs w:val="false"/>
+                <w:color w:val="000000"/>
+                <w:sz w:val="18"/>
+                <w:szCs w:val="18"/>
+              </w:rPr>
+              <w:t xml:space="preserve">Kaku-Ackah Giovanni</w:t>
+            </w:r>
+          </w:p>
+        </w:tc>
+        <w:tc>
+          <w:tcPr>
+            <w:tcW w:type="dxa" w:w="1840"/>
+            <w:tcMar>
+              <w:top w:type="dxa" w:w="55"/>
+              <w:left w:type="dxa" w:w="100"/>
+              <w:bottom w:type="dxa" w:w="55"/>
+              <w:right w:type="dxa" w:w="100"/>
+            </w:tcMar>
+            <w:vAlign w:val="center"/>
+          </w:tcPr>
+          <w:p>
+            <w:pPr>
+              <w:spacing w:after="0" w:line="240"/>
+              <w:jc w:val="center"/>
+            </w:pPr>
+            <w:r>
+              <w:rPr>
+                <w:rFonts w:ascii="Times New Roman" w:cs="Times New Roman" w:eastAsia="Times New Roman" w:hAnsi="Times New Roman"/>
+                <w:b w:val="false"/>
+                <w:bCs w:val="false"/>
+                <w:color w:val="000000"/>
+                <w:sz w:val="18"/>
+                <w:szCs w:val="18"/>
+              </w:rPr>
+              <w:t xml:space="preserve">21133250</w:t>
+            </w:r>
+          </w:p>
+        </w:tc>
+        <w:tc>
+          <w:tcPr>
+            <w:tcW w:type="dxa" w:w="1840"/>
+            <w:tcMar>
+              <w:top w:type="dxa" w:w="55"/>
+              <w:left w:type="dxa" w:w="100"/>
+              <w:bottom w:type="dxa" w:w="55"/>
+              <w:right w:type="dxa" w:w="100"/>
+            </w:tcMar>
+            <w:vAlign w:val="center"/>
+          </w:tcPr>
+          <w:p>
+            <w:pPr>
+              <w:spacing w:after="0" w:line="240"/>
+              <w:jc w:val="center"/>
+            </w:pPr>
+            <w:r>
+              <w:rPr>
+                <w:rFonts w:ascii="Times New Roman" w:cs="Times New Roman" w:eastAsia="Times New Roman" w:hAnsi="Times New Roman"/>
+                <w:b w:val="false"/>
+                <w:bCs w:val="false"/>
+                <w:color w:val="000000"/>
+                <w:sz w:val="18"/>
+                <w:szCs w:val="18"/>
+              </w:rPr>
+              <w:t xml:space="preserve">6163324</w:t>
             </w:r>
           </w:p>
         </w:tc>
@@ -2136,18 +2184,19 @@
       <w:tr>
         <w:tc>
           <w:tcPr>
-            <w:tcW w:type="dxa" w:w="700"/>
-            <w:tcMar>
-              <w:top w:type="dxa" w:w="55"/>
-              <w:left w:type="dxa" w:w="100"/>
-              <w:bottom w:type="dxa" w:w="55"/>
-              <w:right w:type="dxa" w:w="100"/>
-            </w:tcMar>
-            <w:vAlign w:val="center"/>
-          </w:tcPr>
-          <w:p>
-            <w:pPr>
-              <w:spacing w:after="0" w:line="240"/>
+            <w:tcW w:type="dxa" w:w="640"/>
+            <w:tcMar>
+              <w:top w:type="dxa" w:w="55"/>
+              <w:left w:type="dxa" w:w="100"/>
+              <w:bottom w:type="dxa" w:w="55"/>
+              <w:right w:type="dxa" w:w="100"/>
+            </w:tcMar>
+            <w:vAlign w:val="center"/>
+          </w:tcPr>
+          <w:p>
+            <w:pPr>
+              <w:spacing w:after="0" w:line="240"/>
+              <w:jc w:val="center"/>
             </w:pPr>
             <w:r>
               <w:rPr>
@@ -2164,85 +2213,87 @@
         </w:tc>
         <w:tc>
           <w:tcPr>
-            <w:tcW w:type="dxa" w:w="4520"/>
-            <w:tcMar>
-              <w:top w:type="dxa" w:w="55"/>
-              <w:left w:type="dxa" w:w="100"/>
-              <w:bottom w:type="dxa" w:w="55"/>
-              <w:right w:type="dxa" w:w="100"/>
-            </w:tcMar>
-            <w:vAlign w:val="center"/>
-          </w:tcPr>
-          <w:p>
-            <w:pPr>
-              <w:spacing w:after="0" w:line="240"/>
-            </w:pPr>
-            <w:r>
-              <w:rPr>
-                <w:rFonts w:ascii="Times New Roman" w:cs="Times New Roman" w:eastAsia="Times New Roman" w:hAnsi="Times New Roman"/>
-                <w:b w:val="false"/>
-                <w:bCs w:val="false"/>
-                <w:color w:val="000000"/>
-                <w:sz w:val="18"/>
-                <w:szCs w:val="18"/>
-              </w:rPr>
-              <w:t xml:space="preserve"/>
-            </w:r>
-          </w:p>
-        </w:tc>
-        <w:tc>
-          <w:tcPr>
-            <w:tcW w:type="dxa" w:w="1900"/>
-            <w:tcMar>
-              <w:top w:type="dxa" w:w="55"/>
-              <w:left w:type="dxa" w:w="100"/>
-              <w:bottom w:type="dxa" w:w="55"/>
-              <w:right w:type="dxa" w:w="100"/>
-            </w:tcMar>
-            <w:vAlign w:val="center"/>
-          </w:tcPr>
-          <w:p>
-            <w:pPr>
-              <w:spacing w:after="0" w:line="240"/>
-            </w:pPr>
-            <w:r>
-              <w:rPr>
-                <w:rFonts w:ascii="Times New Roman" w:cs="Times New Roman" w:eastAsia="Times New Roman" w:hAnsi="Times New Roman"/>
-                <w:b w:val="false"/>
-                <w:bCs w:val="false"/>
-                <w:color w:val="000000"/>
-                <w:sz w:val="18"/>
-                <w:szCs w:val="18"/>
-              </w:rPr>
-              <w:t xml:space="preserve"/>
-            </w:r>
-          </w:p>
-        </w:tc>
-        <w:tc>
-          <w:tcPr>
-            <w:tcW w:type="dxa" w:w="1900"/>
-            <w:tcMar>
-              <w:top w:type="dxa" w:w="55"/>
-              <w:left w:type="dxa" w:w="100"/>
-              <w:bottom w:type="dxa" w:w="55"/>
-              <w:right w:type="dxa" w:w="100"/>
-            </w:tcMar>
-            <w:vAlign w:val="center"/>
-          </w:tcPr>
-          <w:p>
-            <w:pPr>
-              <w:spacing w:after="0" w:line="240"/>
-            </w:pPr>
-            <w:r>
-              <w:rPr>
-                <w:rFonts w:ascii="Times New Roman" w:cs="Times New Roman" w:eastAsia="Times New Roman" w:hAnsi="Times New Roman"/>
-                <w:b w:val="false"/>
-                <w:bCs w:val="false"/>
-                <w:color w:val="000000"/>
-                <w:sz w:val="18"/>
-                <w:szCs w:val="18"/>
-              </w:rPr>
-              <w:t xml:space="preserve"/>
+            <w:tcW w:type="dxa" w:w="4700"/>
+            <w:tcMar>
+              <w:top w:type="dxa" w:w="55"/>
+              <w:left w:type="dxa" w:w="100"/>
+              <w:bottom w:type="dxa" w:w="55"/>
+              <w:right w:type="dxa" w:w="100"/>
+            </w:tcMar>
+            <w:vAlign w:val="center"/>
+          </w:tcPr>
+          <w:p>
+            <w:pPr>
+              <w:spacing w:after="0" w:line="240"/>
+            </w:pPr>
+            <w:r>
+              <w:rPr>
+                <w:rFonts w:ascii="Times New Roman" w:cs="Times New Roman" w:eastAsia="Times New Roman" w:hAnsi="Times New Roman"/>
+                <w:b w:val="false"/>
+                <w:bCs w:val="false"/>
+                <w:color w:val="000000"/>
+                <w:sz w:val="18"/>
+                <w:szCs w:val="18"/>
+              </w:rPr>
+              <w:t xml:space="preserve">Romeo Ntow Morcher</w:t>
+            </w:r>
+          </w:p>
+        </w:tc>
+        <w:tc>
+          <w:tcPr>
+            <w:tcW w:type="dxa" w:w="1840"/>
+            <w:tcMar>
+              <w:top w:type="dxa" w:w="55"/>
+              <w:left w:type="dxa" w:w="100"/>
+              <w:bottom w:type="dxa" w:w="55"/>
+              <w:right w:type="dxa" w:w="100"/>
+            </w:tcMar>
+            <w:vAlign w:val="center"/>
+          </w:tcPr>
+          <w:p>
+            <w:pPr>
+              <w:spacing w:after="0" w:line="240"/>
+              <w:jc w:val="center"/>
+            </w:pPr>
+            <w:r>
+              <w:rPr>
+                <w:rFonts w:ascii="Times New Roman" w:cs="Times New Roman" w:eastAsia="Times New Roman" w:hAnsi="Times New Roman"/>
+                <w:b w:val="false"/>
+                <w:bCs w:val="false"/>
+                <w:color w:val="000000"/>
+                <w:sz w:val="18"/>
+                <w:szCs w:val="18"/>
+              </w:rPr>
+              <w:t xml:space="preserve">21170656</w:t>
+            </w:r>
+          </w:p>
+        </w:tc>
+        <w:tc>
+          <w:tcPr>
+            <w:tcW w:type="dxa" w:w="1840"/>
+            <w:tcMar>
+              <w:top w:type="dxa" w:w="55"/>
+              <w:left w:type="dxa" w:w="100"/>
+              <w:bottom w:type="dxa" w:w="55"/>
+              <w:right w:type="dxa" w:w="100"/>
+            </w:tcMar>
+            <w:vAlign w:val="center"/>
+          </w:tcPr>
+          <w:p>
+            <w:pPr>
+              <w:spacing w:after="0" w:line="240"/>
+              <w:jc w:val="center"/>
+            </w:pPr>
+            <w:r>
+              <w:rPr>
+                <w:rFonts w:ascii="Times New Roman" w:cs="Times New Roman" w:eastAsia="Times New Roman" w:hAnsi="Times New Roman"/>
+                <w:b w:val="false"/>
+                <w:bCs w:val="false"/>
+                <w:color w:val="000000"/>
+                <w:sz w:val="18"/>
+                <w:szCs w:val="18"/>
+              </w:rPr>
+              <w:t xml:space="preserve">6169524</w:t>
             </w:r>
           </w:p>
         </w:tc>
@@ -2250,18 +2301,19 @@
       <w:tr>
         <w:tc>
           <w:tcPr>
-            <w:tcW w:type="dxa" w:w="700"/>
-            <w:tcMar>
-              <w:top w:type="dxa" w:w="55"/>
-              <w:left w:type="dxa" w:w="100"/>
-              <w:bottom w:type="dxa" w:w="55"/>
-              <w:right w:type="dxa" w:w="100"/>
-            </w:tcMar>
-            <w:vAlign w:val="center"/>
-          </w:tcPr>
-          <w:p>
-            <w:pPr>
-              <w:spacing w:after="0" w:line="240"/>
+            <w:tcW w:type="dxa" w:w="640"/>
+            <w:tcMar>
+              <w:top w:type="dxa" w:w="55"/>
+              <w:left w:type="dxa" w:w="100"/>
+              <w:bottom w:type="dxa" w:w="55"/>
+              <w:right w:type="dxa" w:w="100"/>
+            </w:tcMar>
+            <w:vAlign w:val="center"/>
+          </w:tcPr>
+          <w:p>
+            <w:pPr>
+              <w:spacing w:after="0" w:line="240"/>
+              <w:jc w:val="center"/>
             </w:pPr>
             <w:r>
               <w:rPr>
@@ -2278,85 +2330,87 @@
         </w:tc>
         <w:tc>
           <w:tcPr>
-            <w:tcW w:type="dxa" w:w="4520"/>
-            <w:tcMar>
-              <w:top w:type="dxa" w:w="55"/>
-              <w:left w:type="dxa" w:w="100"/>
-              <w:bottom w:type="dxa" w:w="55"/>
-              <w:right w:type="dxa" w:w="100"/>
-            </w:tcMar>
-            <w:vAlign w:val="center"/>
-          </w:tcPr>
-          <w:p>
-            <w:pPr>
-              <w:spacing w:after="0" w:line="240"/>
-            </w:pPr>
-            <w:r>
-              <w:rPr>
-                <w:rFonts w:ascii="Times New Roman" w:cs="Times New Roman" w:eastAsia="Times New Roman" w:hAnsi="Times New Roman"/>
-                <w:b w:val="false"/>
-                <w:bCs w:val="false"/>
-                <w:color w:val="000000"/>
-                <w:sz w:val="18"/>
-                <w:szCs w:val="18"/>
-              </w:rPr>
-              <w:t xml:space="preserve"/>
-            </w:r>
-          </w:p>
-        </w:tc>
-        <w:tc>
-          <w:tcPr>
-            <w:tcW w:type="dxa" w:w="1900"/>
-            <w:tcMar>
-              <w:top w:type="dxa" w:w="55"/>
-              <w:left w:type="dxa" w:w="100"/>
-              <w:bottom w:type="dxa" w:w="55"/>
-              <w:right w:type="dxa" w:w="100"/>
-            </w:tcMar>
-            <w:vAlign w:val="center"/>
-          </w:tcPr>
-          <w:p>
-            <w:pPr>
-              <w:spacing w:after="0" w:line="240"/>
-            </w:pPr>
-            <w:r>
-              <w:rPr>
-                <w:rFonts w:ascii="Times New Roman" w:cs="Times New Roman" w:eastAsia="Times New Roman" w:hAnsi="Times New Roman"/>
-                <w:b w:val="false"/>
-                <w:bCs w:val="false"/>
-                <w:color w:val="000000"/>
-                <w:sz w:val="18"/>
-                <w:szCs w:val="18"/>
-              </w:rPr>
-              <w:t xml:space="preserve"/>
-            </w:r>
-          </w:p>
-        </w:tc>
-        <w:tc>
-          <w:tcPr>
-            <w:tcW w:type="dxa" w:w="1900"/>
-            <w:tcMar>
-              <w:top w:type="dxa" w:w="55"/>
-              <w:left w:type="dxa" w:w="100"/>
-              <w:bottom w:type="dxa" w:w="55"/>
-              <w:right w:type="dxa" w:w="100"/>
-            </w:tcMar>
-            <w:vAlign w:val="center"/>
-          </w:tcPr>
-          <w:p>
-            <w:pPr>
-              <w:spacing w:after="0" w:line="240"/>
-            </w:pPr>
-            <w:r>
-              <w:rPr>
-                <w:rFonts w:ascii="Times New Roman" w:cs="Times New Roman" w:eastAsia="Times New Roman" w:hAnsi="Times New Roman"/>
-                <w:b w:val="false"/>
-                <w:bCs w:val="false"/>
-                <w:color w:val="000000"/>
-                <w:sz w:val="18"/>
-                <w:szCs w:val="18"/>
-              </w:rPr>
-              <w:t xml:space="preserve"/>
+            <w:tcW w:type="dxa" w:w="4700"/>
+            <w:tcMar>
+              <w:top w:type="dxa" w:w="55"/>
+              <w:left w:type="dxa" w:w="100"/>
+              <w:bottom w:type="dxa" w:w="55"/>
+              <w:right w:type="dxa" w:w="100"/>
+            </w:tcMar>
+            <w:vAlign w:val="center"/>
+          </w:tcPr>
+          <w:p>
+            <w:pPr>
+              <w:spacing w:after="0" w:line="240"/>
+            </w:pPr>
+            <w:r>
+              <w:rPr>
+                <w:rFonts w:ascii="Times New Roman" w:cs="Times New Roman" w:eastAsia="Times New Roman" w:hAnsi="Times New Roman"/>
+                <w:b w:val="false"/>
+                <w:bCs w:val="false"/>
+                <w:color w:val="000000"/>
+                <w:sz w:val="18"/>
+                <w:szCs w:val="18"/>
+              </w:rPr>
+              <w:t xml:space="preserve">Abbas Sirina Safianu</w:t>
+            </w:r>
+          </w:p>
+        </w:tc>
+        <w:tc>
+          <w:tcPr>
+            <w:tcW w:type="dxa" w:w="1840"/>
+            <w:tcMar>
+              <w:top w:type="dxa" w:w="55"/>
+              <w:left w:type="dxa" w:w="100"/>
+              <w:bottom w:type="dxa" w:w="55"/>
+              <w:right w:type="dxa" w:w="100"/>
+            </w:tcMar>
+            <w:vAlign w:val="center"/>
+          </w:tcPr>
+          <w:p>
+            <w:pPr>
+              <w:spacing w:after="0" w:line="240"/>
+              <w:jc w:val="center"/>
+            </w:pPr>
+            <w:r>
+              <w:rPr>
+                <w:rFonts w:ascii="Times New Roman" w:cs="Times New Roman" w:eastAsia="Times New Roman" w:hAnsi="Times New Roman"/>
+                <w:b w:val="false"/>
+                <w:bCs w:val="false"/>
+                <w:color w:val="000000"/>
+                <w:sz w:val="18"/>
+                <w:szCs w:val="18"/>
+              </w:rPr>
+              <w:t xml:space="preserve">21165815</w:t>
+            </w:r>
+          </w:p>
+        </w:tc>
+        <w:tc>
+          <w:tcPr>
+            <w:tcW w:type="dxa" w:w="1840"/>
+            <w:tcMar>
+              <w:top w:type="dxa" w:w="55"/>
+              <w:left w:type="dxa" w:w="100"/>
+              <w:bottom w:type="dxa" w:w="55"/>
+              <w:right w:type="dxa" w:w="100"/>
+            </w:tcMar>
+            <w:vAlign w:val="center"/>
+          </w:tcPr>
+          <w:p>
+            <w:pPr>
+              <w:spacing w:after="0" w:line="240"/>
+              <w:jc w:val="center"/>
+            </w:pPr>
+            <w:r>
+              <w:rPr>
+                <w:rFonts w:ascii="Times New Roman" w:cs="Times New Roman" w:eastAsia="Times New Roman" w:hAnsi="Times New Roman"/>
+                <w:b w:val="false"/>
+                <w:bCs w:val="false"/>
+                <w:color w:val="000000"/>
+                <w:sz w:val="18"/>
+                <w:szCs w:val="18"/>
+              </w:rPr>
+              <w:t xml:space="preserve">6122724</w:t>
             </w:r>
           </w:p>
         </w:tc>
@@ -2364,18 +2418,19 @@
       <w:tr>
         <w:tc>
           <w:tcPr>
-            <w:tcW w:type="dxa" w:w="700"/>
-            <w:tcMar>
-              <w:top w:type="dxa" w:w="55"/>
-              <w:left w:type="dxa" w:w="100"/>
-              <w:bottom w:type="dxa" w:w="55"/>
-              <w:right w:type="dxa" w:w="100"/>
-            </w:tcMar>
-            <w:vAlign w:val="center"/>
-          </w:tcPr>
-          <w:p>
-            <w:pPr>
-              <w:spacing w:after="0" w:line="240"/>
+            <w:tcW w:type="dxa" w:w="640"/>
+            <w:tcMar>
+              <w:top w:type="dxa" w:w="55"/>
+              <w:left w:type="dxa" w:w="100"/>
+              <w:bottom w:type="dxa" w:w="55"/>
+              <w:right w:type="dxa" w:w="100"/>
+            </w:tcMar>
+            <w:vAlign w:val="center"/>
+          </w:tcPr>
+          <w:p>
+            <w:pPr>
+              <w:spacing w:after="0" w:line="240"/>
+              <w:jc w:val="center"/>
             </w:pPr>
             <w:r>
               <w:rPr>
@@ -2392,85 +2447,87 @@
         </w:tc>
         <w:tc>
           <w:tcPr>
-            <w:tcW w:type="dxa" w:w="4520"/>
-            <w:tcMar>
-              <w:top w:type="dxa" w:w="55"/>
-              <w:left w:type="dxa" w:w="100"/>
-              <w:bottom w:type="dxa" w:w="55"/>
-              <w:right w:type="dxa" w:w="100"/>
-            </w:tcMar>
-            <w:vAlign w:val="center"/>
-          </w:tcPr>
-          <w:p>
-            <w:pPr>
-              <w:spacing w:after="0" w:line="240"/>
-            </w:pPr>
-            <w:r>
-              <w:rPr>
-                <w:rFonts w:ascii="Times New Roman" w:cs="Times New Roman" w:eastAsia="Times New Roman" w:hAnsi="Times New Roman"/>
-                <w:b w:val="false"/>
-                <w:bCs w:val="false"/>
-                <w:color w:val="000000"/>
-                <w:sz w:val="18"/>
-                <w:szCs w:val="18"/>
-              </w:rPr>
-              <w:t xml:space="preserve"/>
-            </w:r>
-          </w:p>
-        </w:tc>
-        <w:tc>
-          <w:tcPr>
-            <w:tcW w:type="dxa" w:w="1900"/>
-            <w:tcMar>
-              <w:top w:type="dxa" w:w="55"/>
-              <w:left w:type="dxa" w:w="100"/>
-              <w:bottom w:type="dxa" w:w="55"/>
-              <w:right w:type="dxa" w:w="100"/>
-            </w:tcMar>
-            <w:vAlign w:val="center"/>
-          </w:tcPr>
-          <w:p>
-            <w:pPr>
-              <w:spacing w:after="0" w:line="240"/>
-            </w:pPr>
-            <w:r>
-              <w:rPr>
-                <w:rFonts w:ascii="Times New Roman" w:cs="Times New Roman" w:eastAsia="Times New Roman" w:hAnsi="Times New Roman"/>
-                <w:b w:val="false"/>
-                <w:bCs w:val="false"/>
-                <w:color w:val="000000"/>
-                <w:sz w:val="18"/>
-                <w:szCs w:val="18"/>
-              </w:rPr>
-              <w:t xml:space="preserve"/>
-            </w:r>
-          </w:p>
-        </w:tc>
-        <w:tc>
-          <w:tcPr>
-            <w:tcW w:type="dxa" w:w="1900"/>
-            <w:tcMar>
-              <w:top w:type="dxa" w:w="55"/>
-              <w:left w:type="dxa" w:w="100"/>
-              <w:bottom w:type="dxa" w:w="55"/>
-              <w:right w:type="dxa" w:w="100"/>
-            </w:tcMar>
-            <w:vAlign w:val="center"/>
-          </w:tcPr>
-          <w:p>
-            <w:pPr>
-              <w:spacing w:after="0" w:line="240"/>
-            </w:pPr>
-            <w:r>
-              <w:rPr>
-                <w:rFonts w:ascii="Times New Roman" w:cs="Times New Roman" w:eastAsia="Times New Roman" w:hAnsi="Times New Roman"/>
-                <w:b w:val="false"/>
-                <w:bCs w:val="false"/>
-                <w:color w:val="000000"/>
-                <w:sz w:val="18"/>
-                <w:szCs w:val="18"/>
-              </w:rPr>
-              <w:t xml:space="preserve"/>
+            <w:tcW w:type="dxa" w:w="4700"/>
+            <w:tcMar>
+              <w:top w:type="dxa" w:w="55"/>
+              <w:left w:type="dxa" w:w="100"/>
+              <w:bottom w:type="dxa" w:w="55"/>
+              <w:right w:type="dxa" w:w="100"/>
+            </w:tcMar>
+            <w:vAlign w:val="center"/>
+          </w:tcPr>
+          <w:p>
+            <w:pPr>
+              <w:spacing w:after="0" w:line="240"/>
+            </w:pPr>
+            <w:r>
+              <w:rPr>
+                <w:rFonts w:ascii="Times New Roman" w:cs="Times New Roman" w:eastAsia="Times New Roman" w:hAnsi="Times New Roman"/>
+                <w:b w:val="false"/>
+                <w:bCs w:val="false"/>
+                <w:color w:val="000000"/>
+                <w:sz w:val="18"/>
+                <w:szCs w:val="18"/>
+              </w:rPr>
+              <w:t xml:space="preserve">Tetteh-Abotsi Selorm</w:t>
+            </w:r>
+          </w:p>
+        </w:tc>
+        <w:tc>
+          <w:tcPr>
+            <w:tcW w:type="dxa" w:w="1840"/>
+            <w:tcMar>
+              <w:top w:type="dxa" w:w="55"/>
+              <w:left w:type="dxa" w:w="100"/>
+              <w:bottom w:type="dxa" w:w="55"/>
+              <w:right w:type="dxa" w:w="100"/>
+            </w:tcMar>
+            <w:vAlign w:val="center"/>
+          </w:tcPr>
+          <w:p>
+            <w:pPr>
+              <w:spacing w:after="0" w:line="240"/>
+              <w:jc w:val="center"/>
+            </w:pPr>
+            <w:r>
+              <w:rPr>
+                <w:rFonts w:ascii="Times New Roman" w:cs="Times New Roman" w:eastAsia="Times New Roman" w:hAnsi="Times New Roman"/>
+                <w:b w:val="false"/>
+                <w:bCs w:val="false"/>
+                <w:color w:val="000000"/>
+                <w:sz w:val="18"/>
+                <w:szCs w:val="18"/>
+              </w:rPr>
+              <w:t xml:space="preserve">21131951</w:t>
+            </w:r>
+          </w:p>
+        </w:tc>
+        <w:tc>
+          <w:tcPr>
+            <w:tcW w:type="dxa" w:w="1840"/>
+            <w:tcMar>
+              <w:top w:type="dxa" w:w="55"/>
+              <w:left w:type="dxa" w:w="100"/>
+              <w:bottom w:type="dxa" w:w="55"/>
+              <w:right w:type="dxa" w:w="100"/>
+            </w:tcMar>
+            <w:vAlign w:val="center"/>
+          </w:tcPr>
+          <w:p>
+            <w:pPr>
+              <w:spacing w:after="0" w:line="240"/>
+              <w:jc w:val="center"/>
+            </w:pPr>
+            <w:r>
+              <w:rPr>
+                <w:rFonts w:ascii="Times New Roman" w:cs="Times New Roman" w:eastAsia="Times New Roman" w:hAnsi="Times New Roman"/>
+                <w:b w:val="false"/>
+                <w:bCs w:val="false"/>
+                <w:color w:val="000000"/>
+                <w:sz w:val="18"/>
+                <w:szCs w:val="18"/>
+              </w:rPr>
+              <w:t xml:space="preserve">6181024</w:t>
             </w:r>
           </w:p>
         </w:tc>
@@ -2478,18 +2535,19 @@
       <w:tr>
         <w:tc>
           <w:tcPr>
-            <w:tcW w:type="dxa" w:w="700"/>
-            <w:tcMar>
-              <w:top w:type="dxa" w:w="55"/>
-              <w:left w:type="dxa" w:w="100"/>
-              <w:bottom w:type="dxa" w:w="55"/>
-              <w:right w:type="dxa" w:w="100"/>
-            </w:tcMar>
-            <w:vAlign w:val="center"/>
-          </w:tcPr>
-          <w:p>
-            <w:pPr>
-              <w:spacing w:after="0" w:line="240"/>
+            <w:tcW w:type="dxa" w:w="640"/>
+            <w:tcMar>
+              <w:top w:type="dxa" w:w="55"/>
+              <w:left w:type="dxa" w:w="100"/>
+              <w:bottom w:type="dxa" w:w="55"/>
+              <w:right w:type="dxa" w:w="100"/>
+            </w:tcMar>
+            <w:vAlign w:val="center"/>
+          </w:tcPr>
+          <w:p>
+            <w:pPr>
+              <w:spacing w:after="0" w:line="240"/>
+              <w:jc w:val="center"/>
             </w:pPr>
             <w:r>
               <w:rPr>
@@ -2506,85 +2564,87 @@
         </w:tc>
         <w:tc>
           <w:tcPr>
-            <w:tcW w:type="dxa" w:w="4520"/>
-            <w:tcMar>
-              <w:top w:type="dxa" w:w="55"/>
-              <w:left w:type="dxa" w:w="100"/>
-              <w:bottom w:type="dxa" w:w="55"/>
-              <w:right w:type="dxa" w:w="100"/>
-            </w:tcMar>
-            <w:vAlign w:val="center"/>
-          </w:tcPr>
-          <w:p>
-            <w:pPr>
-              <w:spacing w:after="0" w:line="240"/>
-            </w:pPr>
-            <w:r>
-              <w:rPr>
-                <w:rFonts w:ascii="Times New Roman" w:cs="Times New Roman" w:eastAsia="Times New Roman" w:hAnsi="Times New Roman"/>
-                <w:b w:val="false"/>
-                <w:bCs w:val="false"/>
-                <w:color w:val="000000"/>
-                <w:sz w:val="18"/>
-                <w:szCs w:val="18"/>
-              </w:rPr>
-              <w:t xml:space="preserve"/>
-            </w:r>
-          </w:p>
-        </w:tc>
-        <w:tc>
-          <w:tcPr>
-            <w:tcW w:type="dxa" w:w="1900"/>
-            <w:tcMar>
-              <w:top w:type="dxa" w:w="55"/>
-              <w:left w:type="dxa" w:w="100"/>
-              <w:bottom w:type="dxa" w:w="55"/>
-              <w:right w:type="dxa" w:w="100"/>
-            </w:tcMar>
-            <w:vAlign w:val="center"/>
-          </w:tcPr>
-          <w:p>
-            <w:pPr>
-              <w:spacing w:after="0" w:line="240"/>
-            </w:pPr>
-            <w:r>
-              <w:rPr>
-                <w:rFonts w:ascii="Times New Roman" w:cs="Times New Roman" w:eastAsia="Times New Roman" w:hAnsi="Times New Roman"/>
-                <w:b w:val="false"/>
-                <w:bCs w:val="false"/>
-                <w:color w:val="000000"/>
-                <w:sz w:val="18"/>
-                <w:szCs w:val="18"/>
-              </w:rPr>
-              <w:t xml:space="preserve"/>
-            </w:r>
-          </w:p>
-        </w:tc>
-        <w:tc>
-          <w:tcPr>
-            <w:tcW w:type="dxa" w:w="1900"/>
-            <w:tcMar>
-              <w:top w:type="dxa" w:w="55"/>
-              <w:left w:type="dxa" w:w="100"/>
-              <w:bottom w:type="dxa" w:w="55"/>
-              <w:right w:type="dxa" w:w="100"/>
-            </w:tcMar>
-            <w:vAlign w:val="center"/>
-          </w:tcPr>
-          <w:p>
-            <w:pPr>
-              <w:spacing w:after="0" w:line="240"/>
-            </w:pPr>
-            <w:r>
-              <w:rPr>
-                <w:rFonts w:ascii="Times New Roman" w:cs="Times New Roman" w:eastAsia="Times New Roman" w:hAnsi="Times New Roman"/>
-                <w:b w:val="false"/>
-                <w:bCs w:val="false"/>
-                <w:color w:val="000000"/>
-                <w:sz w:val="18"/>
-                <w:szCs w:val="18"/>
-              </w:rPr>
-              <w:t xml:space="preserve"/>
+            <w:tcW w:type="dxa" w:w="4700"/>
+            <w:tcMar>
+              <w:top w:type="dxa" w:w="55"/>
+              <w:left w:type="dxa" w:w="100"/>
+              <w:bottom w:type="dxa" w:w="55"/>
+              <w:right w:type="dxa" w:w="100"/>
+            </w:tcMar>
+            <w:vAlign w:val="center"/>
+          </w:tcPr>
+          <w:p>
+            <w:pPr>
+              <w:spacing w:after="0" w:line="240"/>
+            </w:pPr>
+            <w:r>
+              <w:rPr>
+                <w:rFonts w:ascii="Times New Roman" w:cs="Times New Roman" w:eastAsia="Times New Roman" w:hAnsi="Times New Roman"/>
+                <w:b w:val="false"/>
+                <w:bCs w:val="false"/>
+                <w:color w:val="000000"/>
+                <w:sz w:val="18"/>
+                <w:szCs w:val="18"/>
+              </w:rPr>
+              <w:t xml:space="preserve">Barnes Nana Ofori Agyemang</w:t>
+            </w:r>
+          </w:p>
+        </w:tc>
+        <w:tc>
+          <w:tcPr>
+            <w:tcW w:type="dxa" w:w="1840"/>
+            <w:tcMar>
+              <w:top w:type="dxa" w:w="55"/>
+              <w:left w:type="dxa" w:w="100"/>
+              <w:bottom w:type="dxa" w:w="55"/>
+              <w:right w:type="dxa" w:w="100"/>
+            </w:tcMar>
+            <w:vAlign w:val="center"/>
+          </w:tcPr>
+          <w:p>
+            <w:pPr>
+              <w:spacing w:after="0" w:line="240"/>
+              <w:jc w:val="center"/>
+            </w:pPr>
+            <w:r>
+              <w:rPr>
+                <w:rFonts w:ascii="Times New Roman" w:cs="Times New Roman" w:eastAsia="Times New Roman" w:hAnsi="Times New Roman"/>
+                <w:b w:val="false"/>
+                <w:bCs w:val="false"/>
+                <w:color w:val="000000"/>
+                <w:sz w:val="18"/>
+                <w:szCs w:val="18"/>
+              </w:rPr>
+              <w:t xml:space="preserve">21147769</w:t>
+            </w:r>
+          </w:p>
+        </w:tc>
+        <w:tc>
+          <w:tcPr>
+            <w:tcW w:type="dxa" w:w="1840"/>
+            <w:tcMar>
+              <w:top w:type="dxa" w:w="55"/>
+              <w:left w:type="dxa" w:w="100"/>
+              <w:bottom w:type="dxa" w:w="55"/>
+              <w:right w:type="dxa" w:w="100"/>
+            </w:tcMar>
+            <w:vAlign w:val="center"/>
+          </w:tcPr>
+          <w:p>
+            <w:pPr>
+              <w:spacing w:after="0" w:line="240"/>
+              <w:jc w:val="center"/>
+            </w:pPr>
+            <w:r>
+              <w:rPr>
+                <w:rFonts w:ascii="Times New Roman" w:cs="Times New Roman" w:eastAsia="Times New Roman" w:hAnsi="Times New Roman"/>
+                <w:b w:val="false"/>
+                <w:bCs w:val="false"/>
+                <w:color w:val="000000"/>
+                <w:sz w:val="18"/>
+                <w:szCs w:val="18"/>
+              </w:rPr>
+              <w:t xml:space="preserve">6148324</w:t>
             </w:r>
           </w:p>
         </w:tc>

</xml_diff>